<commit_message>
Update Instruction Documentation for Room Creation and Participant Management
- Revised the instructions for creating rooms and managing participants, clarifying the process for both administrators and mediators.
- Enhanced sections on jurisdiction selection, participant creation, and reuse rules to improve understanding of user roles and responsibilities.
- Updated the **Sides** menu documentation to reflect changes in participant visibility and management, ensuring consistency across user experiences.

These updates aim to provide clearer guidance and enhance the usability of the documentation for all user roles involved in mediation.
</commit_message>
<xml_diff>
--- a/public/docs/en/mediator.docx
+++ b/public/docs/en/mediator.docx
@@ -2325,6 +2325,117 @@
     </w:p>
     <w:p>
       <w:pPr>
+        <w:spacing w:after="160" w:line="276"/>
+      </w:pPr>
+      <w:r>
+        <w:rPr>
+          <w:rFonts w:ascii="Calibri" w:cs="Calibri" w:eastAsia="Calibri" w:hAnsi="Calibri"/>
+          <w:color w:val="1A1A18"/>
+          <w:sz w:val="22"/>
+          <w:szCs w:val="22"/>
+        </w:rPr>
+        <w:t xml:space="preserve">Path: </w:t>
+      </w:r>
+      <w:r>
+        <w:rPr>
+          <w:rFonts w:ascii="Calibri" w:cs="Calibri" w:eastAsia="Calibri" w:hAnsi="Calibri"/>
+          <w:b/>
+          <w:bCs/>
+          <w:color w:val="1A1A18"/>
+          <w:sz w:val="22"/>
+          <w:szCs w:val="22"/>
+        </w:rPr>
+        <w:t xml:space="preserve">Rooms</w:t>
+      </w:r>
+      <w:r>
+        <w:rPr>
+          <w:rFonts w:ascii="Calibri" w:cs="Calibri" w:eastAsia="Calibri" w:hAnsi="Calibri"/>
+          <w:color w:val="1A1A18"/>
+          <w:sz w:val="22"/>
+          <w:szCs w:val="22"/>
+        </w:rPr>
+        <w:t xml:space="preserve"> → </w:t>
+      </w:r>
+      <w:r>
+        <w:rPr>
+          <w:rFonts w:ascii="Calibri" w:cs="Calibri" w:eastAsia="Calibri" w:hAnsi="Calibri"/>
+          <w:b/>
+          <w:bCs/>
+          <w:color w:val="1A1A18"/>
+          <w:sz w:val="22"/>
+          <w:szCs w:val="22"/>
+        </w:rPr>
+        <w:t xml:space="preserve">New Room</w:t>
+      </w:r>
+      <w:r>
+        <w:rPr>
+          <w:rFonts w:ascii="Calibri" w:cs="Calibri" w:eastAsia="Calibri" w:hAnsi="Calibri"/>
+          <w:color w:val="1A1A18"/>
+          <w:sz w:val="22"/>
+          <w:szCs w:val="22"/>
+        </w:rPr>
+        <w:t xml:space="preserve"> (or </w:t>
+      </w:r>
+      <w:r>
+        <w:rPr>
+          <w:rFonts w:ascii="Calibri" w:cs="Calibri" w:eastAsia="Calibri" w:hAnsi="Calibri"/>
+          <w:b/>
+          <w:bCs/>
+          <w:color w:val="1A1A18"/>
+          <w:sz w:val="22"/>
+          <w:szCs w:val="22"/>
+        </w:rPr>
+        <w:t xml:space="preserve">Return to rooms</w:t>
+      </w:r>
+      <w:r>
+        <w:rPr>
+          <w:rFonts w:ascii="Calibri" w:cs="Calibri" w:eastAsia="Calibri" w:hAnsi="Calibri"/>
+          <w:color w:val="1A1A18"/>
+          <w:sz w:val="22"/>
+          <w:szCs w:val="22"/>
+        </w:rPr>
+        <w:t xml:space="preserve">). Subtitle: set up the room and both sides; credentials are generated for </w:t>
+      </w:r>
+      <w:r>
+        <w:rPr>
+          <w:rFonts w:ascii="Calibri" w:cs="Calibri" w:eastAsia="Calibri" w:hAnsi="Calibri"/>
+          <w:b/>
+          <w:bCs/>
+          <w:color w:val="1A1A18"/>
+          <w:sz w:val="22"/>
+          <w:szCs w:val="22"/>
+        </w:rPr>
+        <w:t xml:space="preserve">new</w:t>
+      </w:r>
+      <w:r>
+        <w:rPr>
+          <w:rFonts w:ascii="Calibri" w:cs="Calibri" w:eastAsia="Calibri" w:hAnsi="Calibri"/>
+          <w:color w:val="1A1A18"/>
+          <w:sz w:val="22"/>
+          <w:szCs w:val="22"/>
+        </w:rPr>
+        <w:t xml:space="preserve"> participants when you create the room.</w:t>
+      </w:r>
+    </w:p>
+    <w:p>
+      <w:pPr>
+        <w:pStyle w:val="Heading3"/>
+        <w:spacing w:after="80" w:before="200"/>
+      </w:pPr>
+      <w:r>
+        <w:rPr>
+          <w:rFonts w:ascii="Calibri" w:cs="Calibri" w:eastAsia="Calibri" w:hAnsi="Calibri"/>
+          <w:b/>
+          <w:bCs/>
+          <w:color w:val="1A1A18"/>
+          <w:sz w:val="24"/>
+          <w:szCs w:val="24"/>
+        </w:rPr>
+        <w:t xml:space="preserve">Room details</w:t>
+      </w:r>
+    </w:p>
+    <w:p>
+      <w:pPr>
         <w:pStyle w:val="ListParagraph"/>
         <w:numPr>
           <w:ilvl w:val="0"/>
@@ -2341,16 +2452,36 @@
           <w:sz w:val="22"/>
           <w:szCs w:val="22"/>
         </w:rPr>
-        <w:t xml:space="preserve">New Room</w:t>
-      </w:r>
-      <w:r>
-        <w:rPr>
-          <w:rFonts w:ascii="Calibri" w:cs="Calibri" w:eastAsia="Calibri" w:hAnsi="Calibri"/>
-          <w:color w:val="1A1A18"/>
-          <w:sz w:val="22"/>
-          <w:szCs w:val="22"/>
-        </w:rPr>
-        <w:t xml:space="preserve">.</w:t>
+        <w:t xml:space="preserve">Room title</w:t>
+      </w:r>
+      <w:r>
+        <w:rPr>
+          <w:rFonts w:ascii="Calibri" w:cs="Calibri" w:eastAsia="Calibri" w:hAnsi="Calibri"/>
+          <w:color w:val="1A1A18"/>
+          <w:sz w:val="22"/>
+          <w:szCs w:val="22"/>
+        </w:rPr>
+        <w:t xml:space="preserve">, </w:t>
+      </w:r>
+      <w:r>
+        <w:rPr>
+          <w:rFonts w:ascii="Calibri" w:cs="Calibri" w:eastAsia="Calibri" w:hAnsi="Calibri"/>
+          <w:b/>
+          <w:bCs/>
+          <w:color w:val="1A1A18"/>
+          <w:sz w:val="22"/>
+          <w:szCs w:val="22"/>
+        </w:rPr>
+        <w:t xml:space="preserve">Room description</w:t>
+      </w:r>
+      <w:r>
+        <w:rPr>
+          <w:rFonts w:ascii="Calibri" w:cs="Calibri" w:eastAsia="Calibri" w:hAnsi="Calibri"/>
+          <w:color w:val="1A1A18"/>
+          <w:sz w:val="22"/>
+          <w:szCs w:val="22"/>
+        </w:rPr>
+        <w:t xml:space="preserve"> (required).</w:t>
       </w:r>
     </w:p>
     <w:p>
@@ -2371,26 +2502,6 @@
           <w:sz w:val="22"/>
           <w:szCs w:val="22"/>
         </w:rPr>
-        <w:t xml:space="preserve">Room details</w:t>
-      </w:r>
-      <w:r>
-        <w:rPr>
-          <w:rFonts w:ascii="Calibri" w:cs="Calibri" w:eastAsia="Calibri" w:hAnsi="Calibri"/>
-          <w:color w:val="1A1A18"/>
-          <w:sz w:val="22"/>
-          <w:szCs w:val="22"/>
-        </w:rPr>
-        <w:t xml:space="preserve">: title, description; </w:t>
-      </w:r>
-      <w:r>
-        <w:rPr>
-          <w:rFonts w:ascii="Calibri" w:cs="Calibri" w:eastAsia="Calibri" w:hAnsi="Calibri"/>
-          <w:b/>
-          <w:bCs/>
-          <w:color w:val="1A1A18"/>
-          <w:sz w:val="22"/>
-          <w:szCs w:val="22"/>
-        </w:rPr>
         <w:t xml:space="preserve">Jurisdiction</w:t>
       </w:r>
       <w:r>
@@ -2400,7 +2511,7 @@
           <w:sz w:val="22"/>
           <w:szCs w:val="22"/>
         </w:rPr>
-        <w:t xml:space="preserve"> (</w:t>
+        <w:t xml:space="preserve"> — </w:t>
       </w:r>
       <w:r>
         <w:rPr>
@@ -2440,7 +2551,7 @@
           <w:sz w:val="22"/>
           <w:szCs w:val="22"/>
         </w:rPr>
-        <w:t xml:space="preserve"> + for the US </w:t>
+        <w:t xml:space="preserve"> (+ help blurbs). For the US: required </w:t>
       </w:r>
       <w:r>
         <w:rPr>
@@ -2460,7 +2571,7 @@
           <w:sz w:val="22"/>
           <w:szCs w:val="22"/>
         </w:rPr>
-        <w:t xml:space="preserve">). Jurisdiction cannot be changed after creation.</w:t>
+        <w:t xml:space="preserve">.</w:t>
       </w:r>
     </w:p>
     <w:p>
@@ -2479,18 +2590,350 @@
           <w:sz w:val="22"/>
           <w:szCs w:val="22"/>
         </w:rPr>
-        <w:t xml:space="preserve">For </w:t>
-      </w:r>
-      <w:r>
-        <w:rPr>
-          <w:rFonts w:ascii="Calibri" w:cs="Calibri" w:eastAsia="Calibri" w:hAnsi="Calibri"/>
-          <w:b/>
-          <w:bCs/>
-          <w:color w:val="1A1A18"/>
-          <w:sz w:val="22"/>
-          <w:szCs w:val="22"/>
-        </w:rPr>
-        <w:t xml:space="preserve">Party A</w:t>
+        <w:t xml:space="preserve">Jurisdiction cannot be changed after creation.</w:t>
+      </w:r>
+    </w:p>
+    <w:p>
+      <w:pPr>
+        <w:pStyle w:val="Heading3"/>
+        <w:spacing w:after="80" w:before="200"/>
+      </w:pPr>
+      <w:r>
+        <w:rPr>
+          <w:rFonts w:ascii="Calibri" w:cs="Calibri" w:eastAsia="Calibri" w:hAnsi="Calibri"/>
+          <w:b/>
+          <w:bCs/>
+          <w:color w:val="1A1A18"/>
+          <w:sz w:val="24"/>
+          <w:szCs w:val="24"/>
+        </w:rPr>
+        <w:t xml:space="preserve">Party A and Party B</w:t>
+      </w:r>
+    </w:p>
+    <w:p>
+      <w:pPr>
+        <w:spacing w:after="160" w:line="276"/>
+      </w:pPr>
+      <w:r>
+        <w:rPr>
+          <w:rFonts w:ascii="Calibri" w:cs="Calibri" w:eastAsia="Calibri" w:hAnsi="Calibri"/>
+          <w:color w:val="1A1A18"/>
+          <w:sz w:val="22"/>
+          <w:szCs w:val="22"/>
+        </w:rPr>
+        <w:t xml:space="preserve">#### Create new participant</w:t>
+      </w:r>
+    </w:p>
+    <w:p>
+      <w:pPr>
+        <w:spacing w:after="160" w:line="276"/>
+      </w:pPr>
+      <w:r>
+        <w:rPr>
+          <w:rFonts w:ascii="Calibri" w:cs="Calibri" w:eastAsia="Calibri" w:hAnsi="Calibri"/>
+          <w:b/>
+          <w:bCs/>
+          <w:color w:val="1A1A18"/>
+          <w:sz w:val="22"/>
+          <w:szCs w:val="22"/>
+        </w:rPr>
+        <w:t xml:space="preserve">Title / Name</w:t>
+      </w:r>
+      <w:r>
+        <w:rPr>
+          <w:rFonts w:ascii="Calibri" w:cs="Calibri" w:eastAsia="Calibri" w:hAnsi="Calibri"/>
+          <w:color w:val="1A1A18"/>
+          <w:sz w:val="22"/>
+          <w:szCs w:val="22"/>
+        </w:rPr>
+        <w:t xml:space="preserve">, </w:t>
+      </w:r>
+      <w:r>
+        <w:rPr>
+          <w:rFonts w:ascii="Calibri" w:cs="Calibri" w:eastAsia="Calibri" w:hAnsi="Calibri"/>
+          <w:b/>
+          <w:bCs/>
+          <w:color w:val="1A1A18"/>
+          <w:sz w:val="22"/>
+          <w:szCs w:val="22"/>
+        </w:rPr>
+        <w:t xml:space="preserve">Description</w:t>
+      </w:r>
+      <w:r>
+        <w:rPr>
+          <w:rFonts w:ascii="Calibri" w:cs="Calibri" w:eastAsia="Calibri" w:hAnsi="Calibri"/>
+          <w:color w:val="1A1A18"/>
+          <w:sz w:val="22"/>
+          <w:szCs w:val="22"/>
+        </w:rPr>
+        <w:t xml:space="preserve"> → new login psylex_… and password.</w:t>
+      </w:r>
+    </w:p>
+    <w:p>
+      <w:pPr>
+        <w:spacing w:after="160" w:line="276"/>
+      </w:pPr>
+      <w:r>
+        <w:rPr>
+          <w:rFonts w:ascii="Calibri" w:cs="Calibri" w:eastAsia="Calibri" w:hAnsi="Calibri"/>
+          <w:color w:val="1A1A18"/>
+          <w:sz w:val="22"/>
+          <w:szCs w:val="22"/>
+        </w:rPr>
+        <w:t xml:space="preserve">#### Add existing participant</w:t>
+      </w:r>
+    </w:p>
+    <w:p>
+      <w:pPr>
+        <w:spacing w:after="160" w:line="276"/>
+      </w:pPr>
+      <w:r>
+        <w:rPr>
+          <w:rFonts w:ascii="Calibri" w:cs="Calibri" w:eastAsia="Calibri" w:hAnsi="Calibri"/>
+          <w:color w:val="1A1A18"/>
+          <w:sz w:val="22"/>
+          <w:szCs w:val="22"/>
+        </w:rPr>
+        <w:t xml:space="preserve">Reuse a party who already appears in </w:t>
+      </w:r>
+      <w:r>
+        <w:rPr>
+          <w:rFonts w:ascii="Calibri" w:cs="Calibri" w:eastAsia="Calibri" w:hAnsi="Calibri"/>
+          <w:b/>
+          <w:bCs/>
+          <w:color w:val="1A1A18"/>
+          <w:sz w:val="22"/>
+          <w:szCs w:val="22"/>
+        </w:rPr>
+        <w:t xml:space="preserve">your</w:t>
+      </w:r>
+      <w:r>
+        <w:rPr>
+          <w:rFonts w:ascii="Calibri" w:cs="Calibri" w:eastAsia="Calibri" w:hAnsi="Calibri"/>
+          <w:color w:val="1A1A18"/>
+          <w:sz w:val="22"/>
+          <w:szCs w:val="22"/>
+        </w:rPr>
+        <w:t xml:space="preserve"> practice:</w:t>
+      </w:r>
+    </w:p>
+    <w:p>
+      <w:pPr>
+        <w:pStyle w:val="ListParagraph"/>
+        <w:numPr>
+          <w:ilvl w:val="0"/>
+          <w:numId w:val="2"/>
+        </w:numPr>
+        <w:spacing w:after="80"/>
+      </w:pPr>
+      <w:r>
+        <w:rPr>
+          <w:rFonts w:ascii="Calibri" w:cs="Calibri" w:eastAsia="Calibri" w:hAnsi="Calibri"/>
+          <w:color w:val="1A1A18"/>
+          <w:sz w:val="22"/>
+          <w:szCs w:val="22"/>
+        </w:rPr>
+        <w:t xml:space="preserve">Switch to </w:t>
+      </w:r>
+      <w:r>
+        <w:rPr>
+          <w:rFonts w:ascii="Calibri" w:cs="Calibri" w:eastAsia="Calibri" w:hAnsi="Calibri"/>
+          <w:b/>
+          <w:bCs/>
+          <w:color w:val="1A1A18"/>
+          <w:sz w:val="22"/>
+          <w:szCs w:val="22"/>
+        </w:rPr>
+        <w:t xml:space="preserve">Add existing participant</w:t>
+      </w:r>
+      <w:r>
+        <w:rPr>
+          <w:rFonts w:ascii="Calibri" w:cs="Calibri" w:eastAsia="Calibri" w:hAnsi="Calibri"/>
+          <w:color w:val="1A1A18"/>
+          <w:sz w:val="22"/>
+          <w:szCs w:val="22"/>
+        </w:rPr>
+        <w:t xml:space="preserve">.</w:t>
+      </w:r>
+    </w:p>
+    <w:p>
+      <w:pPr>
+        <w:pStyle w:val="ListParagraph"/>
+        <w:numPr>
+          <w:ilvl w:val="0"/>
+          <w:numId w:val="2"/>
+        </w:numPr>
+        <w:spacing w:after="80"/>
+      </w:pPr>
+      <w:r>
+        <w:rPr>
+          <w:rFonts w:ascii="Calibri" w:cs="Calibri" w:eastAsia="Calibri" w:hAnsi="Calibri"/>
+          <w:b/>
+          <w:bCs/>
+          <w:color w:val="1A1A18"/>
+          <w:sz w:val="22"/>
+          <w:szCs w:val="22"/>
+        </w:rPr>
+        <w:t xml:space="preserve">Search by login or name…</w:t>
+      </w:r>
+      <w:r>
+        <w:rPr>
+          <w:rFonts w:ascii="Calibri" w:cs="Calibri" w:eastAsia="Calibri" w:hAnsi="Calibri"/>
+          <w:color w:val="1A1A18"/>
+          <w:sz w:val="22"/>
+          <w:szCs w:val="22"/>
+        </w:rPr>
+        <w:t xml:space="preserve"> — as a </w:t>
+      </w:r>
+      <w:r>
+        <w:rPr>
+          <w:rFonts w:ascii="Calibri" w:cs="Calibri" w:eastAsia="Calibri" w:hAnsi="Calibri"/>
+          <w:b/>
+          <w:bCs/>
+          <w:color w:val="1A1A18"/>
+          <w:sz w:val="22"/>
+          <w:szCs w:val="22"/>
+        </w:rPr>
+        <w:t xml:space="preserve">mediator</w:t>
+      </w:r>
+      <w:r>
+        <w:rPr>
+          <w:rFonts w:ascii="Calibri" w:cs="Calibri" w:eastAsia="Calibri" w:hAnsi="Calibri"/>
+          <w:color w:val="1A1A18"/>
+          <w:sz w:val="22"/>
+          <w:szCs w:val="22"/>
+        </w:rPr>
+        <w:t xml:space="preserve">, the pool is </w:t>
+      </w:r>
+      <w:r>
+        <w:rPr>
+          <w:rFonts w:ascii="Calibri" w:cs="Calibri" w:eastAsia="Calibri" w:hAnsi="Calibri"/>
+          <w:b/>
+          <w:bCs/>
+          <w:color w:val="1A1A18"/>
+          <w:sz w:val="22"/>
+          <w:szCs w:val="22"/>
+        </w:rPr>
+        <w:t xml:space="preserve">only parties already in your rooms</w:t>
+      </w:r>
+      <w:r>
+        <w:rPr>
+          <w:rFonts w:ascii="Calibri" w:cs="Calibri" w:eastAsia="Calibri" w:hAnsi="Calibri"/>
+          <w:color w:val="1A1A18"/>
+          <w:sz w:val="22"/>
+          <w:szCs w:val="22"/>
+        </w:rPr>
+        <w:t xml:space="preserve">. Roomless accounts and parties from </w:t>
+      </w:r>
+      <w:r>
+        <w:rPr>
+          <w:rFonts w:ascii="Calibri" w:cs="Calibri" w:eastAsia="Calibri" w:hAnsi="Calibri"/>
+          <w:b/>
+          <w:bCs/>
+          <w:color w:val="1A1A18"/>
+          <w:sz w:val="22"/>
+          <w:szCs w:val="22"/>
+        </w:rPr>
+        <w:t xml:space="preserve">other mediators’</w:t>
+      </w:r>
+      <w:r>
+        <w:rPr>
+          <w:rFonts w:ascii="Calibri" w:cs="Calibri" w:eastAsia="Calibri" w:hAnsi="Calibri"/>
+          <w:color w:val="1A1A18"/>
+          <w:sz w:val="22"/>
+          <w:szCs w:val="22"/>
+        </w:rPr>
+        <w:t xml:space="preserve"> rooms are </w:t>
+      </w:r>
+      <w:r>
+        <w:rPr>
+          <w:rFonts w:ascii="Calibri" w:cs="Calibri" w:eastAsia="Calibri" w:hAnsi="Calibri"/>
+          <w:b/>
+          <w:bCs/>
+          <w:color w:val="1A1A18"/>
+          <w:sz w:val="22"/>
+          <w:szCs w:val="22"/>
+        </w:rPr>
+        <w:t xml:space="preserve">hidden</w:t>
+      </w:r>
+      <w:r>
+        <w:rPr>
+          <w:rFonts w:ascii="Calibri" w:cs="Calibri" w:eastAsia="Calibri" w:hAnsi="Calibri"/>
+          <w:color w:val="1A1A18"/>
+          <w:sz w:val="22"/>
+          <w:szCs w:val="22"/>
+        </w:rPr>
+        <w:t xml:space="preserve">.</w:t>
+      </w:r>
+    </w:p>
+    <w:p>
+      <w:pPr>
+        <w:pStyle w:val="ListParagraph"/>
+        <w:numPr>
+          <w:ilvl w:val="0"/>
+          <w:numId w:val="2"/>
+        </w:numPr>
+        <w:spacing w:after="80"/>
+      </w:pPr>
+      <w:r>
+        <w:rPr>
+          <w:rFonts w:ascii="Calibri" w:cs="Calibri" w:eastAsia="Calibri" w:hAnsi="Calibri"/>
+          <w:color w:val="1A1A18"/>
+          <w:sz w:val="22"/>
+          <w:szCs w:val="22"/>
+        </w:rPr>
+        <w:t xml:space="preserve">Selected card: title (login), </w:t>
+      </w:r>
+      <w:r>
+        <w:rPr>
+          <w:rFonts w:ascii="Calibri" w:cs="Calibri" w:eastAsia="Calibri" w:hAnsi="Calibri"/>
+          <w:b/>
+          <w:bCs/>
+          <w:color w:val="1A1A18"/>
+          <w:sz w:val="22"/>
+          <w:szCs w:val="22"/>
+        </w:rPr>
+        <w:t xml:space="preserve">Profile ready</w:t>
+      </w:r>
+      <w:r>
+        <w:rPr>
+          <w:rFonts w:ascii="Calibri" w:cs="Calibri" w:eastAsia="Calibri" w:hAnsi="Calibri"/>
+          <w:color w:val="1A1A18"/>
+          <w:sz w:val="22"/>
+          <w:szCs w:val="22"/>
+        </w:rPr>
+        <w:t xml:space="preserve"> / </w:t>
+      </w:r>
+      <w:r>
+        <w:rPr>
+          <w:rFonts w:ascii="Calibri" w:cs="Calibri" w:eastAsia="Calibri" w:hAnsi="Calibri"/>
+          <w:b/>
+          <w:bCs/>
+          <w:color w:val="1A1A18"/>
+          <w:sz w:val="22"/>
+          <w:szCs w:val="22"/>
+        </w:rPr>
+        <w:t xml:space="preserve">Profile not ready</w:t>
+      </w:r>
+      <w:r>
+        <w:rPr>
+          <w:rFonts w:ascii="Calibri" w:cs="Calibri" w:eastAsia="Calibri" w:hAnsi="Calibri"/>
+          <w:color w:val="1A1A18"/>
+          <w:sz w:val="22"/>
+          <w:szCs w:val="22"/>
+        </w:rPr>
+        <w:t xml:space="preserve">, badges </w:t>
+      </w:r>
+      <w:r>
+        <w:rPr>
+          <w:rFonts w:ascii="Calibri" w:cs="Calibri" w:eastAsia="Calibri" w:hAnsi="Calibri"/>
+          <w:b/>
+          <w:bCs/>
+          <w:color w:val="1A1A18"/>
+          <w:sz w:val="22"/>
+          <w:szCs w:val="22"/>
+        </w:rPr>
+        <w:t xml:space="preserve">T1–T4</w:t>
       </w:r>
       <w:r>
         <w:rPr>
@@ -2510,7 +2953,148 @@
           <w:sz w:val="22"/>
           <w:szCs w:val="22"/>
         </w:rPr>
-        <w:t xml:space="preserve">Party B</w:t>
+        <w:t xml:space="preserve">BP</w:t>
+      </w:r>
+      <w:r>
+        <w:rPr>
+          <w:rFonts w:ascii="Calibri" w:cs="Calibri" w:eastAsia="Calibri" w:hAnsi="Calibri"/>
+          <w:color w:val="1A1A18"/>
+          <w:sz w:val="22"/>
+          <w:szCs w:val="22"/>
+        </w:rPr>
+        <w:t xml:space="preserve">.</w:t>
+      </w:r>
+    </w:p>
+    <w:p>
+      <w:pPr>
+        <w:spacing w:after="160" w:line="276"/>
+      </w:pPr>
+      <w:r>
+        <w:rPr>
+          <w:rFonts w:ascii="Calibri" w:cs="Calibri" w:eastAsia="Calibri" w:hAnsi="Calibri"/>
+          <w:b/>
+          <w:bCs/>
+          <w:color w:val="1A1A18"/>
+          <w:sz w:val="22"/>
+          <w:szCs w:val="22"/>
+        </w:rPr>
+        <w:t xml:space="preserve">Reuse rules:</w:t>
+      </w:r>
+      <w:r>
+        <w:rPr>
+          <w:rFonts w:ascii="Calibri" w:cs="Calibri" w:eastAsia="Calibri" w:hAnsi="Calibri"/>
+          <w:color w:val="1A1A18"/>
+          <w:sz w:val="22"/>
+          <w:szCs w:val="22"/>
+        </w:rPr>
+        <w:t xml:space="preserve"> tests, personal bot, and onboarding are reused; dispute intake is still required </w:t>
+      </w:r>
+      <w:r>
+        <w:rPr>
+          <w:rFonts w:ascii="Calibri" w:cs="Calibri" w:eastAsia="Calibri" w:hAnsi="Calibri"/>
+          <w:b/>
+          <w:bCs/>
+          <w:color w:val="1A1A18"/>
+          <w:sz w:val="22"/>
+          <w:szCs w:val="22"/>
+        </w:rPr>
+        <w:t xml:space="preserve">for this new room</w:t>
+      </w:r>
+      <w:r>
+        <w:rPr>
+          <w:rFonts w:ascii="Calibri" w:cs="Calibri" w:eastAsia="Calibri" w:hAnsi="Calibri"/>
+          <w:color w:val="1A1A18"/>
+          <w:sz w:val="22"/>
+          <w:szCs w:val="22"/>
+        </w:rPr>
+        <w:t xml:space="preserve">. The same person cannot fill both slots.</w:t>
+      </w:r>
+    </w:p>
+    <w:p>
+      <w:pPr>
+        <w:pStyle w:val="Heading3"/>
+        <w:spacing w:after="80" w:before="200"/>
+      </w:pPr>
+      <w:r>
+        <w:rPr>
+          <w:rFonts w:ascii="Calibri" w:cs="Calibri" w:eastAsia="Calibri" w:hAnsi="Calibri"/>
+          <w:b/>
+          <w:bCs/>
+          <w:color w:val="1A1A18"/>
+          <w:sz w:val="24"/>
+          <w:szCs w:val="24"/>
+        </w:rPr>
+        <w:t xml:space="preserve">Finish and access</w:t>
+      </w:r>
+    </w:p>
+    <w:p>
+      <w:pPr>
+        <w:spacing w:after="160" w:line="276"/>
+      </w:pPr>
+      <w:r>
+        <w:rPr>
+          <w:rFonts w:ascii="Calibri" w:cs="Calibri" w:eastAsia="Calibri" w:hAnsi="Calibri"/>
+          <w:b/>
+          <w:bCs/>
+          <w:color w:val="1A1A18"/>
+          <w:sz w:val="22"/>
+          <w:szCs w:val="22"/>
+        </w:rPr>
+        <w:t xml:space="preserve">Cancel</w:t>
+      </w:r>
+      <w:r>
+        <w:rPr>
+          <w:rFonts w:ascii="Calibri" w:cs="Calibri" w:eastAsia="Calibri" w:hAnsi="Calibri"/>
+          <w:color w:val="1A1A18"/>
+          <w:sz w:val="22"/>
+          <w:szCs w:val="22"/>
+        </w:rPr>
+        <w:t xml:space="preserve"> / </w:t>
+      </w:r>
+      <w:r>
+        <w:rPr>
+          <w:rFonts w:ascii="Calibri" w:cs="Calibri" w:eastAsia="Calibri" w:hAnsi="Calibri"/>
+          <w:b/>
+          <w:bCs/>
+          <w:color w:val="1A1A18"/>
+          <w:sz w:val="22"/>
+          <w:szCs w:val="22"/>
+        </w:rPr>
+        <w:t xml:space="preserve">Create Room</w:t>
+      </w:r>
+      <w:r>
+        <w:rPr>
+          <w:rFonts w:ascii="Calibri" w:cs="Calibri" w:eastAsia="Calibri" w:hAnsi="Calibri"/>
+          <w:color w:val="1A1A18"/>
+          <w:sz w:val="22"/>
+          <w:szCs w:val="22"/>
+        </w:rPr>
+        <w:t xml:space="preserve"> → room card (Mode B).</w:t>
+      </w:r>
+    </w:p>
+    <w:p>
+      <w:pPr>
+        <w:spacing w:after="160" w:line="276"/>
+      </w:pPr>
+      <w:r>
+        <w:rPr>
+          <w:rFonts w:ascii="Calibri" w:cs="Calibri" w:eastAsia="Calibri" w:hAnsi="Calibri"/>
+          <w:color w:val="1A1A18"/>
+          <w:sz w:val="22"/>
+          <w:szCs w:val="22"/>
+        </w:rPr>
+        <w:t xml:space="preserve">On the room card under </w:t>
+      </w:r>
+      <w:r>
+        <w:rPr>
+          <w:rFonts w:ascii="Calibri" w:cs="Calibri" w:eastAsia="Calibri" w:hAnsi="Calibri"/>
+          <w:b/>
+          <w:bCs/>
+          <w:color w:val="1A1A18"/>
+          <w:sz w:val="22"/>
+          <w:szCs w:val="22"/>
+        </w:rPr>
+        <w:t xml:space="preserve">Participants</w:t>
       </w:r>
       <w:r>
         <w:rPr>
@@ -2540,56 +3124,16 @@
           <w:sz w:val="22"/>
           <w:szCs w:val="22"/>
         </w:rPr>
-        <w:t xml:space="preserve">Create new participant</w:t>
-      </w:r>
-      <w:r>
-        <w:rPr>
-          <w:rFonts w:ascii="Calibri" w:cs="Calibri" w:eastAsia="Calibri" w:hAnsi="Calibri"/>
-          <w:color w:val="1A1A18"/>
-          <w:sz w:val="22"/>
-          <w:szCs w:val="22"/>
-        </w:rPr>
-        <w:t xml:space="preserve"> — </w:t>
-      </w:r>
-      <w:r>
-        <w:rPr>
-          <w:rFonts w:ascii="Calibri" w:cs="Calibri" w:eastAsia="Calibri" w:hAnsi="Calibri"/>
-          <w:b/>
-          <w:bCs/>
-          <w:color w:val="1A1A18"/>
-          <w:sz w:val="22"/>
-          <w:szCs w:val="22"/>
-        </w:rPr>
-        <w:t xml:space="preserve">Title / Name</w:t>
-      </w:r>
-      <w:r>
-        <w:rPr>
-          <w:rFonts w:ascii="Calibri" w:cs="Calibri" w:eastAsia="Calibri" w:hAnsi="Calibri"/>
-          <w:color w:val="1A1A18"/>
-          <w:sz w:val="22"/>
-          <w:szCs w:val="22"/>
-        </w:rPr>
-        <w:t xml:space="preserve">, </w:t>
-      </w:r>
-      <w:r>
-        <w:rPr>
-          <w:rFonts w:ascii="Calibri" w:cs="Calibri" w:eastAsia="Calibri" w:hAnsi="Calibri"/>
-          <w:b/>
-          <w:bCs/>
-          <w:color w:val="1A1A18"/>
-          <w:sz w:val="22"/>
-          <w:szCs w:val="22"/>
-        </w:rPr>
-        <w:t xml:space="preserve">Description</w:t>
-      </w:r>
-      <w:r>
-        <w:rPr>
-          <w:rFonts w:ascii="Calibri" w:cs="Calibri" w:eastAsia="Calibri" w:hAnsi="Calibri"/>
-          <w:color w:val="1A1A18"/>
-          <w:sz w:val="22"/>
-          <w:szCs w:val="22"/>
-        </w:rPr>
-        <w:t xml:space="preserve"> (new login psylex_… and password); or</w:t>
+        <w:t xml:space="preserve">Copy Credentials</w:t>
+      </w:r>
+      <w:r>
+        <w:rPr>
+          <w:rFonts w:ascii="Calibri" w:cs="Calibri" w:eastAsia="Calibri" w:hAnsi="Calibri"/>
+          <w:color w:val="1A1A18"/>
+          <w:sz w:val="22"/>
+          <w:szCs w:val="22"/>
+        </w:rPr>
+        <w:t xml:space="preserve"> (login and password);</w:t>
       </w:r>
     </w:p>
     <w:p>
@@ -2610,57 +3154,225 @@
           <w:sz w:val="22"/>
           <w:szCs w:val="22"/>
         </w:rPr>
-        <w:t xml:space="preserve">Add existing participant</w:t>
-      </w:r>
-      <w:r>
-        <w:rPr>
-          <w:rFonts w:ascii="Calibri" w:cs="Calibri" w:eastAsia="Calibri" w:hAnsi="Calibri"/>
-          <w:color w:val="1A1A18"/>
-          <w:sz w:val="22"/>
-          <w:szCs w:val="22"/>
-        </w:rPr>
-        <w:t xml:space="preserve"> — search by login or name (</w:t>
-      </w:r>
-      <w:r>
-        <w:rPr>
-          <w:rFonts w:ascii="Calibri" w:cs="Calibri" w:eastAsia="Calibri" w:hAnsi="Calibri"/>
-          <w:b/>
-          <w:bCs/>
-          <w:color w:val="1A1A18"/>
-          <w:sz w:val="22"/>
-          <w:szCs w:val="22"/>
-        </w:rPr>
-        <w:t xml:space="preserve">only parties from your rooms</w:t>
-      </w:r>
-      <w:r>
-        <w:rPr>
-          <w:rFonts w:ascii="Calibri" w:cs="Calibri" w:eastAsia="Calibri" w:hAnsi="Calibri"/>
-          <w:color w:val="1A1A18"/>
-          <w:sz w:val="22"/>
-          <w:szCs w:val="22"/>
-        </w:rPr>
-        <w:t xml:space="preserve">; roomless accounts and other mediators’ parties are hidden).</w:t>
-      </w:r>
-    </w:p>
-    <w:p>
-      <w:pPr>
-        <w:pStyle w:val="ListParagraph"/>
-        <w:numPr>
-          <w:ilvl w:val="0"/>
-          <w:numId w:val="2"/>
-        </w:numPr>
-        <w:spacing w:after="80"/>
-      </w:pPr>
-      <w:r>
-        <w:rPr>
-          <w:rFonts w:ascii="Calibri" w:cs="Calibri" w:eastAsia="Calibri" w:hAnsi="Calibri"/>
-          <w:b/>
-          <w:bCs/>
-          <w:color w:val="1A1A18"/>
-          <w:sz w:val="22"/>
-          <w:szCs w:val="22"/>
-        </w:rPr>
-        <w:t xml:space="preserve">Create Room</w:t>
+        <w:t xml:space="preserve">Magic Link</w:t>
+      </w:r>
+      <w:r>
+        <w:rPr>
+          <w:rFonts w:ascii="Calibri" w:cs="Calibri" w:eastAsia="Calibri" w:hAnsi="Calibri"/>
+          <w:color w:val="1A1A18"/>
+          <w:sz w:val="22"/>
+          <w:szCs w:val="22"/>
+        </w:rPr>
+        <w:t xml:space="preserve"> — one-time, </w:t>
+      </w:r>
+      <w:r>
+        <w:rPr>
+          <w:rFonts w:ascii="Calibri" w:cs="Calibri" w:eastAsia="Calibri" w:hAnsi="Calibri"/>
+          <w:b/>
+          <w:bCs/>
+          <w:color w:val="1A1A18"/>
+          <w:sz w:val="22"/>
+          <w:szCs w:val="22"/>
+        </w:rPr>
+        <w:t xml:space="preserve">72 hours</w:t>
+      </w:r>
+      <w:r>
+        <w:rPr>
+          <w:rFonts w:ascii="Calibri" w:cs="Calibri" w:eastAsia="Calibri" w:hAnsi="Calibri"/>
+          <w:color w:val="1A1A18"/>
+          <w:sz w:val="22"/>
+          <w:szCs w:val="22"/>
+        </w:rPr>
+        <w:t xml:space="preserve"> (auto sign-in / </w:t>
+      </w:r>
+      <w:r>
+        <w:rPr>
+          <w:rFonts w:ascii="Calibri" w:cs="Calibri" w:eastAsia="Calibri" w:hAnsi="Calibri"/>
+          <w:b/>
+          <w:bCs/>
+          <w:color w:val="1A1A18"/>
+          <w:sz w:val="22"/>
+          <w:szCs w:val="22"/>
+        </w:rPr>
+        <w:t xml:space="preserve">Continue</w:t>
+      </w:r>
+      <w:r>
+        <w:rPr>
+          <w:rFonts w:ascii="Calibri" w:cs="Calibri" w:eastAsia="Calibri" w:hAnsi="Calibri"/>
+          <w:color w:val="1A1A18"/>
+          <w:sz w:val="22"/>
+          <w:szCs w:val="22"/>
+        </w:rPr>
+        <w:t xml:space="preserve"> without JS).</w:t>
+      </w:r>
+    </w:p>
+    <w:p>
+      <w:pPr>
+        <w:spacing w:after="160" w:line="276"/>
+      </w:pPr>
+      <w:r>
+        <w:rPr>
+          <w:rFonts w:ascii="Calibri" w:cs="Calibri" w:eastAsia="Calibri" w:hAnsi="Calibri"/>
+          <w:color w:val="1A1A18"/>
+          <w:sz w:val="22"/>
+          <w:szCs w:val="22"/>
+        </w:rPr>
+        <w:t xml:space="preserve">Ask parties to complete onboarding and dispute intake using the party instruction.</w:t>
+      </w:r>
+    </w:p>
+    <w:p>
+      <w:pPr>
+        <w:pBdr>
+          <w:bottom w:val="single" w:color="D8D4CC" w:sz="6" w:space="1"/>
+        </w:pBdr>
+        <w:spacing w:after="120" w:before="120"/>
+      </w:pPr>
+      <w:r>
+        <w:t xml:space="preserve"/>
+      </w:r>
+    </w:p>
+    <w:p>
+      <w:pPr>
+        <w:pStyle w:val="Heading2"/>
+        <w:pBdr>
+          <w:bottom w:val="single" w:color="9A7B2F" w:sz="8" w:space="4"/>
+        </w:pBdr>
+        <w:spacing w:after="120" w:before="280"/>
+      </w:pPr>
+      <w:r>
+        <w:rPr>
+          <w:rFonts w:ascii="Georgia" w:cs="Georgia" w:eastAsia="Georgia" w:hAnsi="Georgia"/>
+          <w:b/>
+          <w:bCs/>
+          <w:color w:val="1A1A18"/>
+          <w:sz w:val="28"/>
+          <w:szCs w:val="28"/>
+        </w:rPr>
+        <w:t xml:space="preserve">6. Sides</w:t>
+      </w:r>
+    </w:p>
+    <w:p>
+      <w:pPr>
+        <w:spacing w:after="160" w:line="276"/>
+      </w:pPr>
+      <w:r>
+        <w:rPr>
+          <w:rFonts w:ascii="Calibri" w:cs="Calibri" w:eastAsia="Calibri" w:hAnsi="Calibri"/>
+          <w:color w:val="1A1A18"/>
+          <w:sz w:val="22"/>
+          <w:szCs w:val="22"/>
+        </w:rPr>
+        <w:t xml:space="preserve">Menu </w:t>
+      </w:r>
+      <w:r>
+        <w:rPr>
+          <w:rFonts w:ascii="Calibri" w:cs="Calibri" w:eastAsia="Calibri" w:hAnsi="Calibri"/>
+          <w:b/>
+          <w:bCs/>
+          <w:color w:val="1A1A18"/>
+          <w:sz w:val="22"/>
+          <w:szCs w:val="22"/>
+        </w:rPr>
+        <w:t xml:space="preserve">Sides</w:t>
+      </w:r>
+      <w:r>
+        <w:rPr>
+          <w:rFonts w:ascii="Calibri" w:cs="Calibri" w:eastAsia="Calibri" w:hAnsi="Calibri"/>
+          <w:color w:val="1A1A18"/>
+          <w:sz w:val="22"/>
+          <w:szCs w:val="22"/>
+        </w:rPr>
+        <w:t xml:space="preserve"> — party registry scoped to </w:t>
+      </w:r>
+      <w:r>
+        <w:rPr>
+          <w:rFonts w:ascii="Calibri" w:cs="Calibri" w:eastAsia="Calibri" w:hAnsi="Calibri"/>
+          <w:b/>
+          <w:bCs/>
+          <w:color w:val="1A1A18"/>
+          <w:sz w:val="22"/>
+          <w:szCs w:val="22"/>
+        </w:rPr>
+        <w:t xml:space="preserve">your</w:t>
+      </w:r>
+      <w:r>
+        <w:rPr>
+          <w:rFonts w:ascii="Calibri" w:cs="Calibri" w:eastAsia="Calibri" w:hAnsi="Calibri"/>
+          <w:color w:val="1A1A18"/>
+          <w:sz w:val="22"/>
+          <w:szCs w:val="22"/>
+        </w:rPr>
+        <w:t xml:space="preserve"> rooms. Subtitle: review test/bot readiness and request selective retests.</w:t>
+      </w:r>
+    </w:p>
+    <w:p>
+      <w:pPr>
+        <w:pBdr>
+          <w:left w:val="single" w:color="9A7B2F" w:sz="16" w:space="8"/>
+        </w:pBdr>
+        <w:shd w:fill="FBF3E2" w:val="clear"/>
+        <w:spacing w:after="160" w:before="80"/>
+        <w:ind w:left="200" w:right="120"/>
+      </w:pPr>
+      <w:r>
+        <w:rPr>
+          <w:rFonts w:ascii="Calibri" w:cs="Calibri" w:eastAsia="Calibri" w:hAnsi="Calibri"/>
+          <w:color w:val="1A1A18"/>
+          <w:sz w:val="22"/>
+          <w:szCs w:val="22"/>
+        </w:rPr>
+        <w:t xml:space="preserve">No </w:t>
+      </w:r>
+      <w:r>
+        <w:rPr>
+          <w:rFonts w:ascii="Calibri" w:cs="Calibri" w:eastAsia="Calibri" w:hAnsi="Calibri"/>
+          <w:b/>
+          <w:bCs/>
+          <w:color w:val="1A1A18"/>
+          <w:sz w:val="22"/>
+          <w:szCs w:val="22"/>
+        </w:rPr>
+        <w:t xml:space="preserve">Add</w:t>
+      </w:r>
+      <w:r>
+        <w:rPr>
+          <w:rFonts w:ascii="Calibri" w:cs="Calibri" w:eastAsia="Calibri" w:hAnsi="Calibri"/>
+          <w:color w:val="1A1A18"/>
+          <w:sz w:val="22"/>
+          <w:szCs w:val="22"/>
+        </w:rPr>
+        <w:t xml:space="preserve"> button here — parties appear via </w:t>
+      </w:r>
+      <w:r>
+        <w:rPr>
+          <w:rFonts w:ascii="Calibri" w:cs="Calibri" w:eastAsia="Calibri" w:hAnsi="Calibri"/>
+          <w:b/>
+          <w:bCs/>
+          <w:color w:val="1A1A18"/>
+          <w:sz w:val="22"/>
+          <w:szCs w:val="22"/>
+        </w:rPr>
+        <w:t xml:space="preserve">New Room</w:t>
+      </w:r>
+      <w:r>
+        <w:rPr>
+          <w:rFonts w:ascii="Calibri" w:cs="Calibri" w:eastAsia="Calibri" w:hAnsi="Calibri"/>
+          <w:color w:val="1A1A18"/>
+          <w:sz w:val="22"/>
+          <w:szCs w:val="22"/>
+        </w:rPr>
+        <w:t xml:space="preserve">. No </w:t>
+      </w:r>
+      <w:r>
+        <w:rPr>
+          <w:rFonts w:ascii="Calibri" w:cs="Calibri" w:eastAsia="Calibri" w:hAnsi="Calibri"/>
+          <w:b/>
+          <w:bCs/>
+          <w:color w:val="1A1A18"/>
+          <w:sz w:val="22"/>
+          <w:szCs w:val="22"/>
+        </w:rPr>
+        <w:t xml:space="preserve">Copy Credentials</w:t>
       </w:r>
       <w:r>
         <w:rPr>
@@ -2680,30 +3392,16 @@
           <w:sz w:val="22"/>
           <w:szCs w:val="22"/>
         </w:rPr>
-        <w:t xml:space="preserve">Cancel</w:t>
-      </w:r>
-      <w:r>
-        <w:rPr>
-          <w:rFonts w:ascii="Calibri" w:cs="Calibri" w:eastAsia="Calibri" w:hAnsi="Calibri"/>
-          <w:color w:val="1A1A18"/>
-          <w:sz w:val="22"/>
-          <w:szCs w:val="22"/>
-        </w:rPr>
-        <w:t xml:space="preserve">.</w:t>
-      </w:r>
-    </w:p>
-    <w:p>
-      <w:pPr>
-        <w:spacing w:after="160" w:line="276"/>
-      </w:pPr>
-      <w:r>
-        <w:rPr>
-          <w:rFonts w:ascii="Calibri" w:cs="Calibri" w:eastAsia="Calibri" w:hAnsi="Calibri"/>
-          <w:color w:val="1A1A18"/>
-          <w:sz w:val="22"/>
-          <w:szCs w:val="22"/>
-        </w:rPr>
-        <w:t xml:space="preserve">The same person cannot fill both slots in one room.</w:t>
+        <w:t xml:space="preserve">Magic Link</w:t>
+      </w:r>
+      <w:r>
+        <w:rPr>
+          <w:rFonts w:ascii="Calibri" w:cs="Calibri" w:eastAsia="Calibri" w:hAnsi="Calibri"/>
+          <w:color w:val="1A1A18"/>
+          <w:sz w:val="22"/>
+          <w:szCs w:val="22"/>
+        </w:rPr>
+        <w:t xml:space="preserve"> on Sides (use the room card). No Admin/Mediator tabs (unlike the admin console).</w:t>
       </w:r>
     </w:p>
     <w:p>
@@ -2720,41 +3418,7 @@
           <w:sz w:val="24"/>
           <w:szCs w:val="24"/>
         </w:rPr>
-        <w:t xml:space="preserve">Giving parties access</w:t>
-      </w:r>
-    </w:p>
-    <w:p>
-      <w:pPr>
-        <w:spacing w:after="160" w:line="276"/>
-      </w:pPr>
-      <w:r>
-        <w:rPr>
-          <w:rFonts w:ascii="Calibri" w:cs="Calibri" w:eastAsia="Calibri" w:hAnsi="Calibri"/>
-          <w:color w:val="1A1A18"/>
-          <w:sz w:val="22"/>
-          <w:szCs w:val="22"/>
-        </w:rPr>
-        <w:t xml:space="preserve">On the room card under </w:t>
-      </w:r>
-      <w:r>
-        <w:rPr>
-          <w:rFonts w:ascii="Calibri" w:cs="Calibri" w:eastAsia="Calibri" w:hAnsi="Calibri"/>
-          <w:b/>
-          <w:bCs/>
-          <w:color w:val="1A1A18"/>
-          <w:sz w:val="22"/>
-          <w:szCs w:val="22"/>
-        </w:rPr>
-        <w:t xml:space="preserve">Participants</w:t>
-      </w:r>
-      <w:r>
-        <w:rPr>
-          <w:rFonts w:ascii="Calibri" w:cs="Calibri" w:eastAsia="Calibri" w:hAnsi="Calibri"/>
-          <w:color w:val="1A1A18"/>
-          <w:sz w:val="22"/>
-          <w:szCs w:val="22"/>
-        </w:rPr>
-        <w:t xml:space="preserve">:</w:t>
+        <w:t xml:space="preserve">Scope</w:t>
       </w:r>
     </w:p>
     <w:p>
@@ -2769,22 +3433,31 @@
       <w:r>
         <w:rPr>
           <w:rFonts w:ascii="Calibri" w:cs="Calibri" w:eastAsia="Calibri" w:hAnsi="Calibri"/>
-          <w:b/>
-          <w:bCs/>
-          <w:color w:val="1A1A18"/>
-          <w:sz w:val="22"/>
-          <w:szCs w:val="22"/>
-        </w:rPr>
-        <w:t xml:space="preserve">Copy Credentials</w:t>
-      </w:r>
-      <w:r>
-        <w:rPr>
-          <w:rFonts w:ascii="Calibri" w:cs="Calibri" w:eastAsia="Calibri" w:hAnsi="Calibri"/>
-          <w:color w:val="1A1A18"/>
-          <w:sz w:val="22"/>
-          <w:szCs w:val="22"/>
-        </w:rPr>
-        <w:t xml:space="preserve"> (login and password);</w:t>
+          <w:color w:val="1A1A18"/>
+          <w:sz w:val="22"/>
+          <w:szCs w:val="22"/>
+        </w:rPr>
+        <w:t xml:space="preserve">You see parties in </w:t>
+      </w:r>
+      <w:r>
+        <w:rPr>
+          <w:rFonts w:ascii="Calibri" w:cs="Calibri" w:eastAsia="Calibri" w:hAnsi="Calibri"/>
+          <w:b/>
+          <w:bCs/>
+          <w:color w:val="1A1A18"/>
+          <w:sz w:val="22"/>
+          <w:szCs w:val="22"/>
+        </w:rPr>
+        <w:t xml:space="preserve">at least one of your rooms</w:t>
+      </w:r>
+      <w:r>
+        <w:rPr>
+          <w:rFonts w:ascii="Calibri" w:cs="Calibri" w:eastAsia="Calibri" w:hAnsi="Calibri"/>
+          <w:color w:val="1A1A18"/>
+          <w:sz w:val="22"/>
+          <w:szCs w:val="22"/>
+        </w:rPr>
+        <w:t xml:space="preserve">.</w:t>
       </w:r>
     </w:p>
     <w:p>
@@ -2799,141 +3472,51 @@
       <w:r>
         <w:rPr>
           <w:rFonts w:ascii="Calibri" w:cs="Calibri" w:eastAsia="Calibri" w:hAnsi="Calibri"/>
-          <w:b/>
-          <w:bCs/>
-          <w:color w:val="1A1A18"/>
-          <w:sz w:val="22"/>
-          <w:szCs w:val="22"/>
-        </w:rPr>
-        <w:t xml:space="preserve">Magic Link</w:t>
-      </w:r>
-      <w:r>
-        <w:rPr>
-          <w:rFonts w:ascii="Calibri" w:cs="Calibri" w:eastAsia="Calibri" w:hAnsi="Calibri"/>
-          <w:color w:val="1A1A18"/>
-          <w:sz w:val="22"/>
-          <w:szCs w:val="22"/>
-        </w:rPr>
-        <w:t xml:space="preserve"> — one-time link valid </w:t>
-      </w:r>
-      <w:r>
-        <w:rPr>
-          <w:rFonts w:ascii="Calibri" w:cs="Calibri" w:eastAsia="Calibri" w:hAnsi="Calibri"/>
-          <w:b/>
-          <w:bCs/>
-          <w:color w:val="1A1A18"/>
-          <w:sz w:val="22"/>
-          <w:szCs w:val="22"/>
-        </w:rPr>
-        <w:t xml:space="preserve">72 hours</w:t>
-      </w:r>
-      <w:r>
-        <w:rPr>
-          <w:rFonts w:ascii="Calibri" w:cs="Calibri" w:eastAsia="Calibri" w:hAnsi="Calibri"/>
-          <w:color w:val="1A1A18"/>
-          <w:sz w:val="22"/>
-          <w:szCs w:val="22"/>
-        </w:rPr>
-        <w:t xml:space="preserve"> (auto sign-in / </w:t>
-      </w:r>
-      <w:r>
-        <w:rPr>
-          <w:rFonts w:ascii="Calibri" w:cs="Calibri" w:eastAsia="Calibri" w:hAnsi="Calibri"/>
-          <w:b/>
-          <w:bCs/>
-          <w:color w:val="1A1A18"/>
-          <w:sz w:val="22"/>
-          <w:szCs w:val="22"/>
-        </w:rPr>
-        <w:t xml:space="preserve">Continue</w:t>
-      </w:r>
-      <w:r>
-        <w:rPr>
-          <w:rFonts w:ascii="Calibri" w:cs="Calibri" w:eastAsia="Calibri" w:hAnsi="Calibri"/>
-          <w:color w:val="1A1A18"/>
-          <w:sz w:val="22"/>
-          <w:szCs w:val="22"/>
-        </w:rPr>
-        <w:t xml:space="preserve"> without JS).</w:t>
-      </w:r>
-    </w:p>
-    <w:p>
-      <w:pPr>
-        <w:spacing w:after="160" w:line="276"/>
-      </w:pPr>
-      <w:r>
-        <w:rPr>
-          <w:rFonts w:ascii="Calibri" w:cs="Calibri" w:eastAsia="Calibri" w:hAnsi="Calibri"/>
-          <w:color w:val="1A1A18"/>
-          <w:sz w:val="22"/>
-          <w:szCs w:val="22"/>
-        </w:rPr>
-        <w:t xml:space="preserve">Ask parties to complete onboarding and dispute intake using the party instruction.</w:t>
-      </w:r>
-    </w:p>
-    <w:p>
-      <w:pPr>
-        <w:pBdr>
-          <w:bottom w:val="single" w:color="D8D4CC" w:sz="6" w:space="1"/>
-        </w:pBdr>
-        <w:spacing w:after="120" w:before="120"/>
-      </w:pPr>
-      <w:r>
-        <w:t xml:space="preserve"/>
-      </w:r>
-    </w:p>
-    <w:p>
-      <w:pPr>
-        <w:pStyle w:val="Heading2"/>
-        <w:pBdr>
-          <w:bottom w:val="single" w:color="9A7B2F" w:sz="8" w:space="4"/>
-        </w:pBdr>
-        <w:spacing w:after="120" w:before="280"/>
-      </w:pPr>
-      <w:r>
-        <w:rPr>
-          <w:rFonts w:ascii="Georgia" w:cs="Georgia" w:eastAsia="Georgia" w:hAnsi="Georgia"/>
-          <w:b/>
-          <w:bCs/>
-          <w:color w:val="1A1A18"/>
-          <w:sz w:val="28"/>
-          <w:szCs w:val="28"/>
-        </w:rPr>
-        <w:t xml:space="preserve">6. Sides</w:t>
-      </w:r>
-    </w:p>
-    <w:p>
-      <w:pPr>
-        <w:spacing w:after="160" w:line="276"/>
-      </w:pPr>
-      <w:r>
-        <w:rPr>
-          <w:rFonts w:ascii="Calibri" w:cs="Calibri" w:eastAsia="Calibri" w:hAnsi="Calibri"/>
-          <w:color w:val="1A1A18"/>
-          <w:sz w:val="22"/>
-          <w:szCs w:val="22"/>
-        </w:rPr>
-        <w:t xml:space="preserve">Menu </w:t>
-      </w:r>
-      <w:r>
-        <w:rPr>
-          <w:rFonts w:ascii="Calibri" w:cs="Calibri" w:eastAsia="Calibri" w:hAnsi="Calibri"/>
-          <w:b/>
-          <w:bCs/>
-          <w:color w:val="1A1A18"/>
-          <w:sz w:val="22"/>
-          <w:szCs w:val="22"/>
-        </w:rPr>
-        <w:t xml:space="preserve">Sides</w:t>
-      </w:r>
-      <w:r>
-        <w:rPr>
-          <w:rFonts w:ascii="Calibri" w:cs="Calibri" w:eastAsia="Calibri" w:hAnsi="Calibri"/>
-          <w:color w:val="1A1A18"/>
-          <w:sz w:val="22"/>
-          <w:szCs w:val="22"/>
-        </w:rPr>
-        <w:t xml:space="preserve"> — registry scoped to your practice.</w:t>
+          <w:color w:val="1A1A18"/>
+          <w:sz w:val="22"/>
+          <w:szCs w:val="22"/>
+        </w:rPr>
+        <w:t xml:space="preserve">Parties with </w:t>
+      </w:r>
+      <w:r>
+        <w:rPr>
+          <w:rFonts w:ascii="Calibri" w:cs="Calibri" w:eastAsia="Calibri" w:hAnsi="Calibri"/>
+          <w:b/>
+          <w:bCs/>
+          <w:color w:val="1A1A18"/>
+          <w:sz w:val="22"/>
+          <w:szCs w:val="22"/>
+        </w:rPr>
+        <w:t xml:space="preserve">no room</w:t>
+      </w:r>
+      <w:r>
+        <w:rPr>
+          <w:rFonts w:ascii="Calibri" w:cs="Calibri" w:eastAsia="Calibri" w:hAnsi="Calibri"/>
+          <w:color w:val="1A1A18"/>
+          <w:sz w:val="22"/>
+          <w:szCs w:val="22"/>
+        </w:rPr>
+        <w:t xml:space="preserve"> are </w:t>
+      </w:r>
+      <w:r>
+        <w:rPr>
+          <w:rFonts w:ascii="Calibri" w:cs="Calibri" w:eastAsia="Calibri" w:hAnsi="Calibri"/>
+          <w:b/>
+          <w:bCs/>
+          <w:color w:val="1A1A18"/>
+          <w:sz w:val="22"/>
+          <w:szCs w:val="22"/>
+        </w:rPr>
+        <w:t xml:space="preserve">hidden</w:t>
+      </w:r>
+      <w:r>
+        <w:rPr>
+          <w:rFonts w:ascii="Calibri" w:cs="Calibri" w:eastAsia="Calibri" w:hAnsi="Calibri"/>
+          <w:color w:val="1A1A18"/>
+          <w:sz w:val="22"/>
+          <w:szCs w:val="22"/>
+        </w:rPr>
+        <w:t xml:space="preserve">.</w:t>
       </w:r>
     </w:p>
     <w:p>
@@ -2952,105 +3535,44 @@
           <w:sz w:val="22"/>
           <w:szCs w:val="22"/>
         </w:rPr>
-        <w:t xml:space="preserve">You see parties that belong to </w:t>
-      </w:r>
-      <w:r>
-        <w:rPr>
-          <w:rFonts w:ascii="Calibri" w:cs="Calibri" w:eastAsia="Calibri" w:hAnsi="Calibri"/>
-          <w:b/>
-          <w:bCs/>
-          <w:color w:val="1A1A18"/>
-          <w:sz w:val="22"/>
-          <w:szCs w:val="22"/>
-        </w:rPr>
-        <w:t xml:space="preserve">at least one of your rooms</w:t>
-      </w:r>
-      <w:r>
-        <w:rPr>
-          <w:rFonts w:ascii="Calibri" w:cs="Calibri" w:eastAsia="Calibri" w:hAnsi="Calibri"/>
-          <w:color w:val="1A1A18"/>
-          <w:sz w:val="22"/>
-          <w:szCs w:val="22"/>
-        </w:rPr>
-        <w:t xml:space="preserve">.</w:t>
-      </w:r>
-    </w:p>
-    <w:p>
-      <w:pPr>
-        <w:pStyle w:val="ListParagraph"/>
-        <w:numPr>
-          <w:ilvl w:val="0"/>
-          <w:numId w:val="1"/>
-        </w:numPr>
-        <w:spacing w:after="80"/>
-      </w:pPr>
-      <w:r>
-        <w:rPr>
-          <w:rFonts w:ascii="Calibri" w:cs="Calibri" w:eastAsia="Calibri" w:hAnsi="Calibri"/>
-          <w:color w:val="1A1A18"/>
-          <w:sz w:val="22"/>
-          <w:szCs w:val="22"/>
-        </w:rPr>
-        <w:t xml:space="preserve">Parties with </w:t>
-      </w:r>
-      <w:r>
-        <w:rPr>
-          <w:rFonts w:ascii="Calibri" w:cs="Calibri" w:eastAsia="Calibri" w:hAnsi="Calibri"/>
-          <w:b/>
-          <w:bCs/>
-          <w:color w:val="1A1A18"/>
-          <w:sz w:val="22"/>
-          <w:szCs w:val="22"/>
-        </w:rPr>
-        <w:t xml:space="preserve">no room</w:t>
-      </w:r>
-      <w:r>
-        <w:rPr>
-          <w:rFonts w:ascii="Calibri" w:cs="Calibri" w:eastAsia="Calibri" w:hAnsi="Calibri"/>
-          <w:color w:val="1A1A18"/>
-          <w:sz w:val="22"/>
-          <w:szCs w:val="22"/>
-        </w:rPr>
-        <w:t xml:space="preserve"> are </w:t>
-      </w:r>
-      <w:r>
-        <w:rPr>
-          <w:rFonts w:ascii="Calibri" w:cs="Calibri" w:eastAsia="Calibri" w:hAnsi="Calibri"/>
-          <w:b/>
-          <w:bCs/>
-          <w:color w:val="1A1A18"/>
-          <w:sz w:val="22"/>
-          <w:szCs w:val="22"/>
-        </w:rPr>
-        <w:t xml:space="preserve">hidden</w:t>
-      </w:r>
-      <w:r>
-        <w:rPr>
-          <w:rFonts w:ascii="Calibri" w:cs="Calibri" w:eastAsia="Calibri" w:hAnsi="Calibri"/>
-          <w:color w:val="1A1A18"/>
-          <w:sz w:val="22"/>
-          <w:szCs w:val="22"/>
-        </w:rPr>
-        <w:t xml:space="preserve">.</w:t>
-      </w:r>
-    </w:p>
-    <w:p>
-      <w:pPr>
-        <w:pStyle w:val="ListParagraph"/>
-        <w:numPr>
-          <w:ilvl w:val="0"/>
-          <w:numId w:val="1"/>
-        </w:numPr>
-        <w:spacing w:after="80"/>
-      </w:pPr>
-      <w:r>
-        <w:rPr>
-          <w:rFonts w:ascii="Calibri" w:cs="Calibri" w:eastAsia="Calibri" w:hAnsi="Calibri"/>
-          <w:color w:val="1A1A18"/>
-          <w:sz w:val="22"/>
-          <w:szCs w:val="22"/>
-        </w:rPr>
-        <w:t xml:space="preserve">Columns: title, login, role, rooms, tests (T1–T4), bot (BP), actions.</w:t>
+        <w:t xml:space="preserve">Parties that exist only in other mediators’ rooms are </w:t>
+      </w:r>
+      <w:r>
+        <w:rPr>
+          <w:rFonts w:ascii="Calibri" w:cs="Calibri" w:eastAsia="Calibri" w:hAnsi="Calibri"/>
+          <w:b/>
+          <w:bCs/>
+          <w:color w:val="1A1A18"/>
+          <w:sz w:val="22"/>
+          <w:szCs w:val="22"/>
+        </w:rPr>
+        <w:t xml:space="preserve">not</w:t>
+      </w:r>
+      <w:r>
+        <w:rPr>
+          <w:rFonts w:ascii="Calibri" w:cs="Calibri" w:eastAsia="Calibri" w:hAnsi="Calibri"/>
+          <w:color w:val="1A1A18"/>
+          <w:sz w:val="22"/>
+          <w:szCs w:val="22"/>
+        </w:rPr>
+        <w:t xml:space="preserve"> listed.</w:t>
+      </w:r>
+    </w:p>
+    <w:p>
+      <w:pPr>
+        <w:pStyle w:val="Heading3"/>
+        <w:spacing w:after="80" w:before="200"/>
+      </w:pPr>
+      <w:r>
+        <w:rPr>
+          <w:rFonts w:ascii="Calibri" w:cs="Calibri" w:eastAsia="Calibri" w:hAnsi="Calibri"/>
+          <w:b/>
+          <w:bCs/>
+          <w:color w:val="1A1A18"/>
+          <w:sz w:val="24"/>
+          <w:szCs w:val="24"/>
+        </w:rPr>
+        <w:t xml:space="preserve">Table</w:t>
       </w:r>
     </w:p>
     <w:p>
@@ -3060,280 +3582,42 @@
       <w:r>
         <w:rPr>
           <w:rFonts w:ascii="Calibri" w:cs="Calibri" w:eastAsia="Calibri" w:hAnsi="Calibri"/>
-          <w:color w:val="1A1A18"/>
-          <w:sz w:val="22"/>
-          <w:szCs w:val="22"/>
-        </w:rPr>
-        <w:t xml:space="preserve">Actions:</w:t>
-      </w:r>
-    </w:p>
-    <w:p>
-      <w:pPr>
-        <w:pStyle w:val="ListParagraph"/>
-        <w:numPr>
-          <w:ilvl w:val="0"/>
-          <w:numId w:val="1"/>
-        </w:numPr>
-        <w:spacing w:after="80"/>
-      </w:pPr>
-      <w:r>
-        <w:rPr>
-          <w:rFonts w:ascii="Calibri" w:cs="Calibri" w:eastAsia="Calibri" w:hAnsi="Calibri"/>
-          <w:b/>
-          <w:bCs/>
-          <w:color w:val="1A1A18"/>
-          <w:sz w:val="22"/>
-          <w:szCs w:val="22"/>
-        </w:rPr>
-        <w:t xml:space="preserve">Edit</w:t>
-      </w:r>
-      <w:r>
-        <w:rPr>
-          <w:rFonts w:ascii="Calibri" w:cs="Calibri" w:eastAsia="Calibri" w:hAnsi="Calibri"/>
-          <w:color w:val="1A1A18"/>
-          <w:sz w:val="22"/>
-          <w:szCs w:val="22"/>
-        </w:rPr>
-        <w:t xml:space="preserve"> title / description;</w:t>
-      </w:r>
-    </w:p>
-    <w:p>
-      <w:pPr>
-        <w:pStyle w:val="ListParagraph"/>
-        <w:numPr>
-          <w:ilvl w:val="0"/>
-          <w:numId w:val="1"/>
-        </w:numPr>
-        <w:spacing w:after="80"/>
-      </w:pPr>
-      <w:r>
-        <w:rPr>
-          <w:rFonts w:ascii="Calibri" w:cs="Calibri" w:eastAsia="Calibri" w:hAnsi="Calibri"/>
-          <w:b/>
-          <w:bCs/>
-          <w:color w:val="1A1A18"/>
-          <w:sz w:val="22"/>
-          <w:szCs w:val="22"/>
-        </w:rPr>
-        <w:t xml:space="preserve">Delete party</w:t>
-      </w:r>
-      <w:r>
-        <w:rPr>
-          <w:rFonts w:ascii="Calibri" w:cs="Calibri" w:eastAsia="Calibri" w:hAnsi="Calibri"/>
-          <w:color w:val="1A1A18"/>
-          <w:sz w:val="22"/>
-          <w:szCs w:val="22"/>
-        </w:rPr>
-        <w:t xml:space="preserve"> (with cascading room rules);</w:t>
-      </w:r>
-    </w:p>
-    <w:p>
-      <w:pPr>
-        <w:pStyle w:val="ListParagraph"/>
-        <w:numPr>
-          <w:ilvl w:val="0"/>
-          <w:numId w:val="1"/>
-        </w:numPr>
-        <w:spacing w:after="80"/>
-      </w:pPr>
-      <w:r>
-        <w:rPr>
-          <w:rFonts w:ascii="Calibri" w:cs="Calibri" w:eastAsia="Calibri" w:hAnsi="Calibri"/>
-          <w:color w:val="1A1A18"/>
-          <w:sz w:val="22"/>
-          <w:szCs w:val="22"/>
-        </w:rPr>
-        <w:t xml:space="preserve">⋮ menu: </w:t>
-      </w:r>
-      <w:r>
-        <w:rPr>
-          <w:rFonts w:ascii="Calibri" w:cs="Calibri" w:eastAsia="Calibri" w:hAnsi="Calibri"/>
-          <w:b/>
-          <w:bCs/>
-          <w:color w:val="1A1A18"/>
-          <w:sz w:val="22"/>
-          <w:szCs w:val="22"/>
-        </w:rPr>
-        <w:t xml:space="preserve">Redo T1…T4</w:t>
-      </w:r>
-      <w:r>
-        <w:rPr>
-          <w:rFonts w:ascii="Calibri" w:cs="Calibri" w:eastAsia="Calibri" w:hAnsi="Calibri"/>
-          <w:color w:val="1A1A18"/>
-          <w:sz w:val="22"/>
-          <w:szCs w:val="22"/>
-        </w:rPr>
-        <w:t xml:space="preserve">, </w:t>
-      </w:r>
-      <w:r>
-        <w:rPr>
-          <w:rFonts w:ascii="Calibri" w:cs="Calibri" w:eastAsia="Calibri" w:hAnsi="Calibri"/>
-          <w:b/>
-          <w:bCs/>
-          <w:color w:val="1A1A18"/>
-          <w:sz w:val="22"/>
-          <w:szCs w:val="22"/>
-        </w:rPr>
-        <w:t xml:space="preserve">Redo all tests</w:t>
-      </w:r>
-      <w:r>
-        <w:rPr>
-          <w:rFonts w:ascii="Calibri" w:cs="Calibri" w:eastAsia="Calibri" w:hAnsi="Calibri"/>
-          <w:color w:val="1A1A18"/>
-          <w:sz w:val="22"/>
-          <w:szCs w:val="22"/>
-        </w:rPr>
-        <w:t xml:space="preserve">, </w:t>
-      </w:r>
-      <w:r>
-        <w:rPr>
-          <w:rFonts w:ascii="Calibri" w:cs="Calibri" w:eastAsia="Calibri" w:hAnsi="Calibri"/>
-          <w:b/>
-          <w:bCs/>
-          <w:color w:val="1A1A18"/>
-          <w:sz w:val="22"/>
-          <w:szCs w:val="22"/>
-        </w:rPr>
-        <w:t xml:space="preserve">Redo bot prompt</w:t>
-      </w:r>
-      <w:r>
-        <w:rPr>
-          <w:rFonts w:ascii="Calibri" w:cs="Calibri" w:eastAsia="Calibri" w:hAnsi="Calibri"/>
-          <w:color w:val="1A1A18"/>
-          <w:sz w:val="22"/>
-          <w:szCs w:val="22"/>
-        </w:rPr>
-        <w:t xml:space="preserve">, </w:t>
-      </w:r>
-      <w:r>
-        <w:rPr>
-          <w:rFonts w:ascii="Calibri" w:cs="Calibri" w:eastAsia="Calibri" w:hAnsi="Calibri"/>
-          <w:b/>
-          <w:bCs/>
-          <w:color w:val="1A1A18"/>
-          <w:sz w:val="22"/>
-          <w:szCs w:val="22"/>
-        </w:rPr>
-        <w:t xml:space="preserve">Redo all</w:t>
-      </w:r>
-      <w:r>
-        <w:rPr>
-          <w:rFonts w:ascii="Calibri" w:cs="Calibri" w:eastAsia="Calibri" w:hAnsi="Calibri"/>
-          <w:color w:val="1A1A18"/>
-          <w:sz w:val="22"/>
-          <w:szCs w:val="22"/>
-        </w:rPr>
-        <w:t xml:space="preserve"> (with confirmation) → </w:t>
-      </w:r>
-      <w:r>
-        <w:rPr>
-          <w:rFonts w:ascii="Calibri" w:cs="Calibri" w:eastAsia="Calibri" w:hAnsi="Calibri"/>
-          <w:b/>
-          <w:bCs/>
-          <w:color w:val="1A1A18"/>
-          <w:sz w:val="22"/>
-          <w:szCs w:val="22"/>
-        </w:rPr>
-        <w:t xml:space="preserve">Retest requested.</w:t>
-      </w:r>
-    </w:p>
-    <w:p>
-      <w:pPr>
-        <w:spacing w:after="160" w:line="276"/>
-      </w:pPr>
-      <w:r>
-        <w:rPr>
-          <w:rFonts w:ascii="Calibri" w:cs="Calibri" w:eastAsia="Calibri" w:hAnsi="Calibri"/>
-          <w:color w:val="1A1A18"/>
-          <w:sz w:val="22"/>
-          <w:szCs w:val="22"/>
-        </w:rPr>
-        <w:t xml:space="preserve">Credentials (login/password/Magic Link) are copied from the </w:t>
-      </w:r>
-      <w:r>
-        <w:rPr>
-          <w:rFonts w:ascii="Calibri" w:cs="Calibri" w:eastAsia="Calibri" w:hAnsi="Calibri"/>
-          <w:b/>
-          <w:bCs/>
-          <w:color w:val="1A1A18"/>
-          <w:sz w:val="22"/>
-          <w:szCs w:val="22"/>
-        </w:rPr>
-        <w:t xml:space="preserve">room card</w:t>
-      </w:r>
-      <w:r>
-        <w:rPr>
-          <w:rFonts w:ascii="Calibri" w:cs="Calibri" w:eastAsia="Calibri" w:hAnsi="Calibri"/>
-          <w:color w:val="1A1A18"/>
-          <w:sz w:val="22"/>
-          <w:szCs w:val="22"/>
-        </w:rPr>
-        <w:t xml:space="preserve">, not from the Sides list.</w:t>
-      </w:r>
-    </w:p>
-    <w:p>
-      <w:pPr>
-        <w:spacing w:after="160" w:line="276"/>
-      </w:pPr>
-      <w:r>
-        <w:rPr>
-          <w:rFonts w:ascii="Calibri" w:cs="Calibri" w:eastAsia="Calibri" w:hAnsi="Calibri"/>
-          <w:color w:val="1A1A18"/>
-          <w:sz w:val="22"/>
-          <w:szCs w:val="22"/>
-        </w:rPr>
-        <w:t xml:space="preserve">Administrators see </w:t>
-      </w:r>
-      <w:r>
-        <w:rPr>
-          <w:rFonts w:ascii="Calibri" w:cs="Calibri" w:eastAsia="Calibri" w:hAnsi="Calibri"/>
-          <w:b/>
-          <w:bCs/>
-          <w:color w:val="1A1A18"/>
-          <w:sz w:val="22"/>
-          <w:szCs w:val="22"/>
-        </w:rPr>
-        <w:t xml:space="preserve">all</w:t>
-      </w:r>
-      <w:r>
-        <w:rPr>
-          <w:rFonts w:ascii="Calibri" w:cs="Calibri" w:eastAsia="Calibri" w:hAnsi="Calibri"/>
-          <w:color w:val="1A1A18"/>
-          <w:sz w:val="22"/>
-          <w:szCs w:val="22"/>
-        </w:rPr>
-        <w:t xml:space="preserve"> parties (including roomless) in their console.</w:t>
-      </w:r>
-    </w:p>
-    <w:p>
-      <w:pPr>
-        <w:pBdr>
-          <w:bottom w:val="single" w:color="D8D4CC" w:sz="6" w:space="1"/>
-        </w:pBdr>
-        <w:spacing w:after="120" w:before="120"/>
-      </w:pPr>
-      <w:r>
-        <w:t xml:space="preserve"/>
-      </w:r>
-    </w:p>
-    <w:p>
-      <w:pPr>
-        <w:pStyle w:val="Heading2"/>
-        <w:pBdr>
-          <w:bottom w:val="single" w:color="9A7B2F" w:sz="8" w:space="4"/>
-        </w:pBdr>
-        <w:spacing w:after="120" w:before="280"/>
-      </w:pPr>
-      <w:r>
-        <w:rPr>
-          <w:rFonts w:ascii="Georgia" w:cs="Georgia" w:eastAsia="Georgia" w:hAnsi="Georgia"/>
-          <w:b/>
-          <w:bCs/>
-          <w:color w:val="1A1A18"/>
-          <w:sz w:val="28"/>
-          <w:szCs w:val="28"/>
-        </w:rPr>
-        <w:t xml:space="preserve">7. Room card</w:t>
+          <w:b/>
+          <w:bCs/>
+          <w:color w:val="1A1A18"/>
+          <w:sz w:val="22"/>
+          <w:szCs w:val="22"/>
+        </w:rPr>
+        <w:t xml:space="preserve">Search...</w:t>
+      </w:r>
+      <w:r>
+        <w:rPr>
+          <w:rFonts w:ascii="Calibri" w:cs="Calibri" w:eastAsia="Calibri" w:hAnsi="Calibri"/>
+          <w:color w:val="1A1A18"/>
+          <w:sz w:val="22"/>
+          <w:szCs w:val="22"/>
+        </w:rPr>
+        <w:t xml:space="preserve">, sortable columns, pagination (</w:t>
+      </w:r>
+      <w:r>
+        <w:rPr>
+          <w:rFonts w:ascii="Calibri" w:cs="Calibri" w:eastAsia="Calibri" w:hAnsi="Calibri"/>
+          <w:b/>
+          <w:bCs/>
+          <w:color w:val="1A1A18"/>
+          <w:sz w:val="22"/>
+          <w:szCs w:val="22"/>
+        </w:rPr>
+        <w:t xml:space="preserve">Rows per page</w:t>
+      </w:r>
+      <w:r>
+        <w:rPr>
+          <w:rFonts w:ascii="Calibri" w:cs="Calibri" w:eastAsia="Calibri" w:hAnsi="Calibri"/>
+          <w:color w:val="1A1A18"/>
+          <w:sz w:val="22"/>
+          <w:szCs w:val="22"/>
+        </w:rPr>
+        <w:t xml:space="preserve"> 10 / 25 / 50).</w:t>
       </w:r>
     </w:p>
     <w:tbl>
@@ -3374,7 +3658,7 @@
                 <w:sz w:val="18"/>
                 <w:szCs w:val="18"/>
               </w:rPr>
-              <w:t xml:space="preserve">Block</w:t>
+              <w:t xml:space="preserve">Column</w:t>
             </w:r>
           </w:p>
         </w:tc>
@@ -3399,7 +3683,7 @@
                 <w:sz w:val="18"/>
                 <w:szCs w:val="18"/>
               </w:rPr>
-              <w:t xml:space="preserve">What the mediator can do</w:t>
+              <w:t xml:space="preserve">Meaning</w:t>
             </w:r>
           </w:p>
         </w:tc>
@@ -3419,11 +3703,13 @@
             <w:r>
               <w:rPr>
                 <w:rFonts w:ascii="Calibri" w:cs="Calibri" w:eastAsia="Calibri" w:hAnsi="Calibri"/>
-                <w:color w:val="1A1A18"/>
-                <w:sz w:val="18"/>
-                <w:szCs w:val="18"/>
-              </w:rPr>
-              <w:t xml:space="preserve">Header</w:t>
+                <w:b/>
+                <w:bCs/>
+                <w:color w:val="1A1A18"/>
+                <w:sz w:val="18"/>
+                <w:szCs w:val="18"/>
+              </w:rPr>
+              <w:t xml:space="preserve">Title</w:t>
             </w:r>
           </w:p>
         </w:tc>
@@ -3445,7 +3731,18 @@
                 <w:sz w:val="18"/>
                 <w:szCs w:val="18"/>
               </w:rPr>
-              <w:t xml:space="preserve">Title, date, jurisdiction</w:t>
+              <w:t xml:space="preserve">Name + description; click or </w:t>
+            </w:r>
+            <w:r>
+              <w:rPr>
+                <w:rFonts w:ascii="Calibri" w:cs="Calibri" w:eastAsia="Calibri" w:hAnsi="Calibri"/>
+                <w:b/>
+                <w:bCs/>
+                <w:color w:val="1A1A18"/>
+                <w:sz w:val="18"/>
+                <w:szCs w:val="18"/>
+              </w:rPr>
+              <w:t xml:space="preserve">Edit</w:t>
             </w:r>
           </w:p>
         </w:tc>
@@ -3471,7 +3768,7 @@
                 <w:sz w:val="18"/>
                 <w:szCs w:val="18"/>
               </w:rPr>
-              <w:t xml:space="preserve">Mediation details</w:t>
+              <w:t xml:space="preserve">Login</w:t>
             </w:r>
           </w:p>
         </w:tc>
@@ -3493,18 +3790,7 @@
                 <w:sz w:val="18"/>
                 <w:szCs w:val="18"/>
               </w:rPr>
-              <w:t xml:space="preserve">After start — dialogue, votes, agreement, </w:t>
-            </w:r>
-            <w:r>
-              <w:rPr>
-                <w:rFonts w:ascii="Calibri" w:cs="Calibri" w:eastAsia="Calibri" w:hAnsi="Calibri"/>
-                <w:b/>
-                <w:bCs/>
-                <w:color w:val="1A1A18"/>
-                <w:sz w:val="18"/>
-                <w:szCs w:val="18"/>
-              </w:rPr>
-              <w:t xml:space="preserve">Download results</w:t>
+              <w:t xml:space="preserve">psylex_…</w:t>
             </w:r>
           </w:p>
         </w:tc>
@@ -3530,7 +3816,7 @@
                 <w:sz w:val="18"/>
                 <w:szCs w:val="18"/>
               </w:rPr>
-              <w:t xml:space="preserve">Mediation schedule</w:t>
+              <w:t xml:space="preserve">Role</w:t>
             </w:r>
           </w:p>
         </w:tc>
@@ -3548,11 +3834,33 @@
             <w:r>
               <w:rPr>
                 <w:rFonts w:ascii="Calibri" w:cs="Calibri" w:eastAsia="Calibri" w:hAnsi="Calibri"/>
-                <w:color w:val="1A1A18"/>
-                <w:sz w:val="18"/>
-                <w:szCs w:val="18"/>
-              </w:rPr>
-              <w:t xml:space="preserve">Date, time, duration, readiness, lobby / session links</w:t>
+                <w:b/>
+                <w:bCs/>
+                <w:color w:val="1A1A18"/>
+                <w:sz w:val="18"/>
+                <w:szCs w:val="18"/>
+              </w:rPr>
+              <w:t xml:space="preserve">A</w:t>
+            </w:r>
+            <w:r>
+              <w:rPr>
+                <w:rFonts w:ascii="Calibri" w:cs="Calibri" w:eastAsia="Calibri" w:hAnsi="Calibri"/>
+                <w:color w:val="1A1A18"/>
+                <w:sz w:val="18"/>
+                <w:szCs w:val="18"/>
+              </w:rPr>
+              <w:t xml:space="preserve"> / </w:t>
+            </w:r>
+            <w:r>
+              <w:rPr>
+                <w:rFonts w:ascii="Calibri" w:cs="Calibri" w:eastAsia="Calibri" w:hAnsi="Calibri"/>
+                <w:b/>
+                <w:bCs/>
+                <w:color w:val="1A1A18"/>
+                <w:sz w:val="18"/>
+                <w:szCs w:val="18"/>
+              </w:rPr>
+              <w:t xml:space="preserve">B</w:t>
             </w:r>
           </w:p>
         </w:tc>
@@ -3578,7 +3886,7 @@
                 <w:sz w:val="18"/>
                 <w:szCs w:val="18"/>
               </w:rPr>
-              <w:t xml:space="preserve">Pipeline &amp; mediation log</w:t>
+              <w:t xml:space="preserve">Rooms</w:t>
             </w:r>
           </w:p>
         </w:tc>
@@ -3600,7 +3908,7 @@
                 <w:sz w:val="18"/>
                 <w:szCs w:val="18"/>
               </w:rPr>
-              <w:t xml:space="preserve">Timeline of preparation and the session</w:t>
+              <w:t xml:space="preserve">Your rooms for this party (A/B badges)</w:t>
             </w:r>
           </w:p>
         </w:tc>
@@ -3626,7 +3934,7 @@
                 <w:sz w:val="18"/>
                 <w:szCs w:val="18"/>
               </w:rPr>
-              <w:t xml:space="preserve">Room details</w:t>
+              <w:t xml:space="preserve">Tests</w:t>
             </w:r>
           </w:p>
         </w:tc>
@@ -3644,22 +3952,22 @@
             <w:r>
               <w:rPr>
                 <w:rFonts w:ascii="Calibri" w:cs="Calibri" w:eastAsia="Calibri" w:hAnsi="Calibri"/>
-                <w:color w:val="1A1A18"/>
-                <w:sz w:val="18"/>
-                <w:szCs w:val="18"/>
-              </w:rPr>
-              <w:t xml:space="preserve">Title and description </w:t>
-            </w:r>
-            <w:r>
-              <w:rPr>
-                <w:rFonts w:ascii="Calibri" w:cs="Calibri" w:eastAsia="Calibri" w:hAnsi="Calibri"/>
                 <w:b/>
                 <w:bCs/>
                 <w:color w:val="1A1A18"/>
                 <w:sz w:val="18"/>
                 <w:szCs w:val="18"/>
               </w:rPr>
-              <w:t xml:space="preserve">view only</w:t>
+              <w:t xml:space="preserve">T1–T4</w:t>
+            </w:r>
+            <w:r>
+              <w:rPr>
+                <w:rFonts w:ascii="Calibri" w:cs="Calibri" w:eastAsia="Calibri" w:hAnsi="Calibri"/>
+                <w:color w:val="1A1A18"/>
+                <w:sz w:val="18"/>
+                <w:szCs w:val="18"/>
+              </w:rPr>
+              <w:t xml:space="preserve"> chips (+ dates when available)</w:t>
             </w:r>
           </w:p>
         </w:tc>
@@ -3685,7 +3993,7 @@
                 <w:sz w:val="18"/>
                 <w:szCs w:val="18"/>
               </w:rPr>
-              <w:t xml:space="preserve">Participants</w:t>
+              <w:t xml:space="preserve">Bot prompt</w:t>
             </w:r>
           </w:p>
         </w:tc>
@@ -3703,62 +4011,22 @@
             <w:r>
               <w:rPr>
                 <w:rFonts w:ascii="Calibri" w:cs="Calibri" w:eastAsia="Calibri" w:hAnsi="Calibri"/>
-                <w:color w:val="1A1A18"/>
-                <w:sz w:val="18"/>
-                <w:szCs w:val="18"/>
-              </w:rPr>
-              <w:t xml:space="preserve">Profile / tests, </w:t>
-            </w:r>
-            <w:r>
-              <w:rPr>
-                <w:rFonts w:ascii="Calibri" w:cs="Calibri" w:eastAsia="Calibri" w:hAnsi="Calibri"/>
                 <w:b/>
                 <w:bCs/>
                 <w:color w:val="1A1A18"/>
                 <w:sz w:val="18"/>
                 <w:szCs w:val="18"/>
               </w:rPr>
-              <w:t xml:space="preserve">Request profile update</w:t>
-            </w:r>
-            <w:r>
-              <w:rPr>
-                <w:rFonts w:ascii="Calibri" w:cs="Calibri" w:eastAsia="Calibri" w:hAnsi="Calibri"/>
-                <w:color w:val="1A1A18"/>
-                <w:sz w:val="18"/>
-                <w:szCs w:val="18"/>
-              </w:rPr>
-              <w:t xml:space="preserve">, login/password, </w:t>
-            </w:r>
-            <w:r>
-              <w:rPr>
-                <w:rFonts w:ascii="Calibri" w:cs="Calibri" w:eastAsia="Calibri" w:hAnsi="Calibri"/>
-                <w:b/>
-                <w:bCs/>
-                <w:color w:val="1A1A18"/>
-                <w:sz w:val="18"/>
-                <w:szCs w:val="18"/>
-              </w:rPr>
-              <w:t xml:space="preserve">Copy Credentials</w:t>
-            </w:r>
-            <w:r>
-              <w:rPr>
-                <w:rFonts w:ascii="Calibri" w:cs="Calibri" w:eastAsia="Calibri" w:hAnsi="Calibri"/>
-                <w:color w:val="1A1A18"/>
-                <w:sz w:val="18"/>
-                <w:szCs w:val="18"/>
-              </w:rPr>
-              <w:t xml:space="preserve">, </w:t>
-            </w:r>
-            <w:r>
-              <w:rPr>
-                <w:rFonts w:ascii="Calibri" w:cs="Calibri" w:eastAsia="Calibri" w:hAnsi="Calibri"/>
-                <w:b/>
-                <w:bCs/>
-                <w:color w:val="1A1A18"/>
-                <w:sz w:val="18"/>
-                <w:szCs w:val="18"/>
-              </w:rPr>
-              <w:t xml:space="preserve">Magic Link</w:t>
+              <w:t xml:space="preserve">BP</w:t>
+            </w:r>
+            <w:r>
+              <w:rPr>
+                <w:rFonts w:ascii="Calibri" w:cs="Calibri" w:eastAsia="Calibri" w:hAnsi="Calibri"/>
+                <w:color w:val="1A1A18"/>
+                <w:sz w:val="18"/>
+                <w:szCs w:val="18"/>
+              </w:rPr>
+              <w:t xml:space="preserve"> chip (+ date)</w:t>
             </w:r>
           </w:p>
         </w:tc>
@@ -3784,7 +4052,7 @@
                 <w:sz w:val="18"/>
                 <w:szCs w:val="18"/>
               </w:rPr>
-              <w:t xml:space="preserve">Delete room</w:t>
+              <w:t xml:space="preserve">Actions</w:t>
             </w:r>
           </w:p>
         </w:tc>
@@ -3806,7 +4074,7 @@
                 <w:sz w:val="18"/>
                 <w:szCs w:val="18"/>
               </w:rPr>
-              <w:t xml:space="preserve">Two options (see below)</w:t>
+              <w:t xml:space="preserve">Edit, Delete, ⋮</w:t>
             </w:r>
           </w:p>
         </w:tc>
@@ -3822,105 +4090,6 @@
     </w:p>
     <w:p>
       <w:pPr>
-        <w:spacing w:after="160" w:line="276"/>
-      </w:pPr>
-      <w:r>
-        <w:rPr>
-          <w:rFonts w:ascii="Calibri" w:cs="Calibri" w:eastAsia="Calibri" w:hAnsi="Calibri"/>
-          <w:b/>
-          <w:bCs/>
-          <w:color w:val="1A1A18"/>
-          <w:sz w:val="22"/>
-          <w:szCs w:val="22"/>
-        </w:rPr>
-        <w:t xml:space="preserve">Request profile update</w:t>
-      </w:r>
-      <w:r>
-        <w:rPr>
-          <w:rFonts w:ascii="Calibri" w:cs="Calibri" w:eastAsia="Calibri" w:hAnsi="Calibri"/>
-          <w:color w:val="1A1A18"/>
-          <w:sz w:val="22"/>
-          <w:szCs w:val="22"/>
-        </w:rPr>
-        <w:t xml:space="preserve"> clears tests, bot, and related data and asks the party to retake onboarding.</w:t>
-      </w:r>
-    </w:p>
-    <w:p>
-      <w:pPr>
-        <w:spacing w:after="160" w:line="276"/>
-      </w:pPr>
-      <w:r>
-        <w:rPr>
-          <w:rFonts w:ascii="Calibri" w:cs="Calibri" w:eastAsia="Calibri" w:hAnsi="Calibri"/>
-          <w:color w:val="1A1A18"/>
-          <w:sz w:val="22"/>
-          <w:szCs w:val="22"/>
-        </w:rPr>
-        <w:t xml:space="preserve">Readiness indicators: </w:t>
-      </w:r>
-      <w:r>
-        <w:rPr>
-          <w:rFonts w:ascii="Calibri" w:cs="Calibri" w:eastAsia="Calibri" w:hAnsi="Calibri"/>
-          <w:b/>
-          <w:bCs/>
-          <w:color w:val="1A1A18"/>
-          <w:sz w:val="22"/>
-          <w:szCs w:val="22"/>
-        </w:rPr>
-        <w:t xml:space="preserve">Party A/B ready</w:t>
-      </w:r>
-      <w:r>
-        <w:rPr>
-          <w:rFonts w:ascii="Calibri" w:cs="Calibri" w:eastAsia="Calibri" w:hAnsi="Calibri"/>
-          <w:color w:val="1A1A18"/>
-          <w:sz w:val="22"/>
-          <w:szCs w:val="22"/>
-        </w:rPr>
-        <w:t xml:space="preserve">, profile readiness, </w:t>
-      </w:r>
-      <w:r>
-        <w:rPr>
-          <w:rFonts w:ascii="Calibri" w:cs="Calibri" w:eastAsia="Calibri" w:hAnsi="Calibri"/>
-          <w:b/>
-          <w:bCs/>
-          <w:color w:val="1A1A18"/>
-          <w:sz w:val="22"/>
-          <w:szCs w:val="22"/>
-        </w:rPr>
-        <w:t xml:space="preserve">AI analysis</w:t>
-      </w:r>
-      <w:r>
-        <w:rPr>
-          <w:rFonts w:ascii="Calibri" w:cs="Calibri" w:eastAsia="Calibri" w:hAnsi="Calibri"/>
-          <w:color w:val="1A1A18"/>
-          <w:sz w:val="22"/>
-          <w:szCs w:val="22"/>
-        </w:rPr>
-        <w:t xml:space="preserve">. Incomplete pipeline steps may show </w:t>
-      </w:r>
-      <w:r>
-        <w:rPr>
-          <w:rFonts w:ascii="Calibri" w:cs="Calibri" w:eastAsia="Calibri" w:hAnsi="Calibri"/>
-          <w:b/>
-          <w:bCs/>
-          <w:color w:val="1A1A18"/>
-          <w:sz w:val="22"/>
-          <w:szCs w:val="22"/>
-        </w:rPr>
-        <w:t xml:space="preserve">Generating…</w:t>
-      </w:r>
-      <w:r>
-        <w:rPr>
-          <w:rFonts w:ascii="Calibri" w:cs="Calibri" w:eastAsia="Calibri" w:hAnsi="Calibri"/>
-          <w:color w:val="1A1A18"/>
-          <w:sz w:val="22"/>
-          <w:szCs w:val="22"/>
-        </w:rPr>
-        <w:t xml:space="preserve">.</w:t>
-      </w:r>
-    </w:p>
-    <w:p>
-      <w:pPr>
         <w:pStyle w:val="Heading3"/>
         <w:spacing w:after="80" w:before="200"/>
       </w:pPr>
@@ -3933,7 +4102,154 @@
           <w:sz w:val="24"/>
           <w:szCs w:val="24"/>
         </w:rPr>
-        <w:t xml:space="preserve">Delete</w:t>
+        <w:t xml:space="preserve">Edit</w:t>
+      </w:r>
+    </w:p>
+    <w:p>
+      <w:pPr>
+        <w:spacing w:after="160" w:line="276"/>
+      </w:pPr>
+      <w:r>
+        <w:rPr>
+          <w:rFonts w:ascii="Calibri" w:cs="Calibri" w:eastAsia="Calibri" w:hAnsi="Calibri"/>
+          <w:b/>
+          <w:bCs/>
+          <w:color w:val="1A1A18"/>
+          <w:sz w:val="22"/>
+          <w:szCs w:val="22"/>
+        </w:rPr>
+        <w:t xml:space="preserve">Edit side</w:t>
+      </w:r>
+      <w:r>
+        <w:rPr>
+          <w:rFonts w:ascii="Calibri" w:cs="Calibri" w:eastAsia="Calibri" w:hAnsi="Calibri"/>
+          <w:color w:val="1A1A18"/>
+          <w:sz w:val="22"/>
+          <w:szCs w:val="22"/>
+        </w:rPr>
+        <w:t xml:space="preserve"> modal: </w:t>
+      </w:r>
+      <w:r>
+        <w:rPr>
+          <w:rFonts w:ascii="Calibri" w:cs="Calibri" w:eastAsia="Calibri" w:hAnsi="Calibri"/>
+          <w:b/>
+          <w:bCs/>
+          <w:color w:val="1A1A18"/>
+          <w:sz w:val="22"/>
+          <w:szCs w:val="22"/>
+        </w:rPr>
+        <w:t xml:space="preserve">Title</w:t>
+      </w:r>
+      <w:r>
+        <w:rPr>
+          <w:rFonts w:ascii="Calibri" w:cs="Calibri" w:eastAsia="Calibri" w:hAnsi="Calibri"/>
+          <w:color w:val="1A1A18"/>
+          <w:sz w:val="22"/>
+          <w:szCs w:val="22"/>
+        </w:rPr>
+        <w:t xml:space="preserve"> and </w:t>
+      </w:r>
+      <w:r>
+        <w:rPr>
+          <w:rFonts w:ascii="Calibri" w:cs="Calibri" w:eastAsia="Calibri" w:hAnsi="Calibri"/>
+          <w:b/>
+          <w:bCs/>
+          <w:color w:val="1A1A18"/>
+          <w:sz w:val="22"/>
+          <w:szCs w:val="22"/>
+        </w:rPr>
+        <w:t xml:space="preserve">Description</w:t>
+      </w:r>
+      <w:r>
+        <w:rPr>
+          <w:rFonts w:ascii="Calibri" w:cs="Calibri" w:eastAsia="Calibri" w:hAnsi="Calibri"/>
+          <w:color w:val="1A1A18"/>
+          <w:sz w:val="22"/>
+          <w:szCs w:val="22"/>
+        </w:rPr>
+        <w:t xml:space="preserve"> required → </w:t>
+      </w:r>
+      <w:r>
+        <w:rPr>
+          <w:rFonts w:ascii="Calibri" w:cs="Calibri" w:eastAsia="Calibri" w:hAnsi="Calibri"/>
+          <w:b/>
+          <w:bCs/>
+          <w:color w:val="1A1A18"/>
+          <w:sz w:val="22"/>
+          <w:szCs w:val="22"/>
+        </w:rPr>
+        <w:t xml:space="preserve">Save Changes</w:t>
+      </w:r>
+      <w:r>
+        <w:rPr>
+          <w:rFonts w:ascii="Calibri" w:cs="Calibri" w:eastAsia="Calibri" w:hAnsi="Calibri"/>
+          <w:color w:val="1A1A18"/>
+          <w:sz w:val="22"/>
+          <w:szCs w:val="22"/>
+        </w:rPr>
+        <w:t xml:space="preserve"> → </w:t>
+      </w:r>
+      <w:r>
+        <w:rPr>
+          <w:rFonts w:ascii="Calibri" w:cs="Calibri" w:eastAsia="Calibri" w:hAnsi="Calibri"/>
+          <w:b/>
+          <w:bCs/>
+          <w:color w:val="1A1A18"/>
+          <w:sz w:val="22"/>
+          <w:szCs w:val="22"/>
+        </w:rPr>
+        <w:t xml:space="preserve">Side updated.</w:t>
+      </w:r>
+      <w:r>
+        <w:rPr>
+          <w:rFonts w:ascii="Calibri" w:cs="Calibri" w:eastAsia="Calibri" w:hAnsi="Calibri"/>
+          <w:color w:val="1A1A18"/>
+          <w:sz w:val="22"/>
+          <w:szCs w:val="22"/>
+        </w:rPr>
+        <w:t xml:space="preserve"> / </w:t>
+      </w:r>
+      <w:r>
+        <w:rPr>
+          <w:rFonts w:ascii="Calibri" w:cs="Calibri" w:eastAsia="Calibri" w:hAnsi="Calibri"/>
+          <w:b/>
+          <w:bCs/>
+          <w:color w:val="1A1A18"/>
+          <w:sz w:val="22"/>
+          <w:szCs w:val="22"/>
+        </w:rPr>
+        <w:t xml:space="preserve">Could not update side.</w:t>
+      </w:r>
+    </w:p>
+    <w:p>
+      <w:pPr>
+        <w:pStyle w:val="Heading3"/>
+        <w:spacing w:after="80" w:before="200"/>
+      </w:pPr>
+      <w:r>
+        <w:rPr>
+          <w:rFonts w:ascii="Calibri" w:cs="Calibri" w:eastAsia="Calibri" w:hAnsi="Calibri"/>
+          <w:b/>
+          <w:bCs/>
+          <w:color w:val="1A1A18"/>
+          <w:sz w:val="24"/>
+          <w:szCs w:val="24"/>
+        </w:rPr>
+        <w:t xml:space="preserve">Delete party</w:t>
+      </w:r>
+    </w:p>
+    <w:p>
+      <w:pPr>
+        <w:spacing w:after="160" w:line="276"/>
+      </w:pPr>
+      <w:r>
+        <w:rPr>
+          <w:rFonts w:ascii="Calibri" w:cs="Calibri" w:eastAsia="Calibri" w:hAnsi="Calibri"/>
+          <w:color w:val="1A1A18"/>
+          <w:sz w:val="22"/>
+          <w:szCs w:val="22"/>
+        </w:rPr>
+        <w:t xml:space="preserve">Confirm dialog means:</w:t>
       </w:r>
     </w:p>
     <w:p>
@@ -3948,22 +4264,31 @@
       <w:r>
         <w:rPr>
           <w:rFonts w:ascii="Calibri" w:cs="Calibri" w:eastAsia="Calibri" w:hAnsi="Calibri"/>
-          <w:b/>
-          <w:bCs/>
-          <w:color w:val="1A1A18"/>
-          <w:sz w:val="22"/>
-          <w:szCs w:val="22"/>
-        </w:rPr>
-        <w:t xml:space="preserve">Delete room only</w:t>
-      </w:r>
-      <w:r>
-        <w:rPr>
-          <w:rFonts w:ascii="Calibri" w:cs="Calibri" w:eastAsia="Calibri" w:hAnsi="Calibri"/>
-          <w:color w:val="1A1A18"/>
-          <w:sz w:val="22"/>
-          <w:szCs w:val="22"/>
-        </w:rPr>
-        <w:t xml:space="preserve"> — party accounts remain;</w:t>
+          <w:color w:val="1A1A18"/>
+          <w:sz w:val="22"/>
+          <w:szCs w:val="22"/>
+        </w:rPr>
+        <w:t xml:space="preserve">The party account is </w:t>
+      </w:r>
+      <w:r>
+        <w:rPr>
+          <w:rFonts w:ascii="Calibri" w:cs="Calibri" w:eastAsia="Calibri" w:hAnsi="Calibri"/>
+          <w:b/>
+          <w:bCs/>
+          <w:color w:val="1A1A18"/>
+          <w:sz w:val="22"/>
+          <w:szCs w:val="22"/>
+        </w:rPr>
+        <w:t xml:space="preserve">removed</w:t>
+      </w:r>
+      <w:r>
+        <w:rPr>
+          <w:rFonts w:ascii="Calibri" w:cs="Calibri" w:eastAsia="Calibri" w:hAnsi="Calibri"/>
+          <w:color w:val="1A1A18"/>
+          <w:sz w:val="22"/>
+          <w:szCs w:val="22"/>
+        </w:rPr>
+        <w:t xml:space="preserve">.</w:t>
       </w:r>
     </w:p>
     <w:p>
@@ -3984,16 +4309,76 @@
           <w:sz w:val="22"/>
           <w:szCs w:val="22"/>
         </w:rPr>
-        <w:t xml:space="preserve">Delete room and parties</w:t>
-      </w:r>
-      <w:r>
-        <w:rPr>
-          <w:rFonts w:ascii="Calibri" w:cs="Calibri" w:eastAsia="Calibri" w:hAnsi="Calibri"/>
-          <w:color w:val="1A1A18"/>
-          <w:sz w:val="22"/>
-          <w:szCs w:val="22"/>
-        </w:rPr>
-        <w:t xml:space="preserve"> — also deletes those party accounts (and related rooms per product rules).</w:t>
+        <w:t xml:space="preserve">Every room</w:t>
+      </w:r>
+      <w:r>
+        <w:rPr>
+          <w:rFonts w:ascii="Calibri" w:cs="Calibri" w:eastAsia="Calibri" w:hAnsi="Calibri"/>
+          <w:color w:val="1A1A18"/>
+          <w:sz w:val="22"/>
+          <w:szCs w:val="22"/>
+        </w:rPr>
+        <w:t xml:space="preserve"> that party belongs to is </w:t>
+      </w:r>
+      <w:r>
+        <w:rPr>
+          <w:rFonts w:ascii="Calibri" w:cs="Calibri" w:eastAsia="Calibri" w:hAnsi="Calibri"/>
+          <w:b/>
+          <w:bCs/>
+          <w:color w:val="1A1A18"/>
+          <w:sz w:val="22"/>
+          <w:szCs w:val="22"/>
+        </w:rPr>
+        <w:t xml:space="preserve">deleted</w:t>
+      </w:r>
+      <w:r>
+        <w:rPr>
+          <w:rFonts w:ascii="Calibri" w:cs="Calibri" w:eastAsia="Calibri" w:hAnsi="Calibri"/>
+          <w:color w:val="1A1A18"/>
+          <w:sz w:val="22"/>
+          <w:szCs w:val="22"/>
+        </w:rPr>
+        <w:t xml:space="preserve"> (including your rooms they are in).</w:t>
+      </w:r>
+    </w:p>
+    <w:p>
+      <w:pPr>
+        <w:pStyle w:val="ListParagraph"/>
+        <w:numPr>
+          <w:ilvl w:val="0"/>
+          <w:numId w:val="1"/>
+        </w:numPr>
+        <w:spacing w:after="80"/>
+      </w:pPr>
+      <w:r>
+        <w:rPr>
+          <w:rFonts w:ascii="Calibri" w:cs="Calibri" w:eastAsia="Calibri" w:hAnsi="Calibri"/>
+          <w:color w:val="1A1A18"/>
+          <w:sz w:val="22"/>
+          <w:szCs w:val="22"/>
+        </w:rPr>
+        <w:t xml:space="preserve">Other parties in those rooms are kept as free / roomless accounts.</w:t>
+      </w:r>
+    </w:p>
+    <w:p>
+      <w:pPr>
+        <w:pStyle w:val="ListParagraph"/>
+        <w:numPr>
+          <w:ilvl w:val="0"/>
+          <w:numId w:val="1"/>
+        </w:numPr>
+        <w:spacing w:after="80"/>
+      </w:pPr>
+      <w:r>
+        <w:rPr>
+          <w:rFonts w:ascii="Calibri" w:cs="Calibri" w:eastAsia="Calibri" w:hAnsi="Calibri"/>
+          <w:b/>
+          <w:bCs/>
+          <w:color w:val="1A1A18"/>
+          <w:sz w:val="22"/>
+          <w:szCs w:val="22"/>
+        </w:rPr>
+        <w:t xml:space="preserve">Cannot be undone.</w:t>
       </w:r>
     </w:p>
     <w:p>
@@ -4003,11 +4388,1260 @@
       <w:r>
         <w:rPr>
           <w:rFonts w:ascii="Calibri" w:cs="Calibri" w:eastAsia="Calibri" w:hAnsi="Calibri"/>
-          <w:color w:val="1A1A18"/>
-          <w:sz w:val="22"/>
-          <w:szCs w:val="22"/>
-        </w:rPr>
-        <w:t xml:space="preserve">Both require confirmation and cannot be undone.</w:t>
+          <w:b/>
+          <w:bCs/>
+          <w:color w:val="1A1A18"/>
+          <w:sz w:val="22"/>
+          <w:szCs w:val="22"/>
+        </w:rPr>
+        <w:t xml:space="preserve">Ownership limit:</w:t>
+      </w:r>
+      <w:r>
+        <w:rPr>
+          <w:rFonts w:ascii="Calibri" w:cs="Calibri" w:eastAsia="Calibri" w:hAnsi="Calibri"/>
+          <w:color w:val="1A1A18"/>
+          <w:sz w:val="22"/>
+          <w:szCs w:val="22"/>
+        </w:rPr>
+        <w:t xml:space="preserve"> if the party also belongs to rooms you do </w:t>
+      </w:r>
+      <w:r>
+        <w:rPr>
+          <w:rFonts w:ascii="Calibri" w:cs="Calibri" w:eastAsia="Calibri" w:hAnsi="Calibri"/>
+          <w:b/>
+          <w:bCs/>
+          <w:color w:val="1A1A18"/>
+          <w:sz w:val="22"/>
+          <w:szCs w:val="22"/>
+        </w:rPr>
+        <w:t xml:space="preserve">not</w:t>
+      </w:r>
+      <w:r>
+        <w:rPr>
+          <w:rFonts w:ascii="Calibri" w:cs="Calibri" w:eastAsia="Calibri" w:hAnsi="Calibri"/>
+          <w:color w:val="1A1A18"/>
+          <w:sz w:val="22"/>
+          <w:szCs w:val="22"/>
+        </w:rPr>
+        <w:t xml:space="preserve"> own, delete fails — ask an </w:t>
+      </w:r>
+      <w:r>
+        <w:rPr>
+          <w:rFonts w:ascii="Calibri" w:cs="Calibri" w:eastAsia="Calibri" w:hAnsi="Calibri"/>
+          <w:b/>
+          <w:bCs/>
+          <w:color w:val="1A1A18"/>
+          <w:sz w:val="22"/>
+          <w:szCs w:val="22"/>
+        </w:rPr>
+        <w:t xml:space="preserve">administrator</w:t>
+      </w:r>
+      <w:r>
+        <w:rPr>
+          <w:rFonts w:ascii="Calibri" w:cs="Calibri" w:eastAsia="Calibri" w:hAnsi="Calibri"/>
+          <w:color w:val="1A1A18"/>
+          <w:sz w:val="22"/>
+          <w:szCs w:val="22"/>
+        </w:rPr>
+        <w:t xml:space="preserve">. Success: </w:t>
+      </w:r>
+      <w:r>
+        <w:rPr>
+          <w:rFonts w:ascii="Calibri" w:cs="Calibri" w:eastAsia="Calibri" w:hAnsi="Calibri"/>
+          <w:b/>
+          <w:bCs/>
+          <w:color w:val="1A1A18"/>
+          <w:sz w:val="22"/>
+          <w:szCs w:val="22"/>
+        </w:rPr>
+        <w:t xml:space="preserve">Party deleted.</w:t>
+      </w:r>
+      <w:r>
+        <w:rPr>
+          <w:rFonts w:ascii="Calibri" w:cs="Calibri" w:eastAsia="Calibri" w:hAnsi="Calibri"/>
+          <w:color w:val="1A1A18"/>
+          <w:sz w:val="22"/>
+          <w:szCs w:val="22"/>
+        </w:rPr>
+        <w:t xml:space="preserve"> Error: </w:t>
+      </w:r>
+      <w:r>
+        <w:rPr>
+          <w:rFonts w:ascii="Calibri" w:cs="Calibri" w:eastAsia="Calibri" w:hAnsi="Calibri"/>
+          <w:b/>
+          <w:bCs/>
+          <w:color w:val="1A1A18"/>
+          <w:sz w:val="22"/>
+          <w:szCs w:val="22"/>
+        </w:rPr>
+        <w:t xml:space="preserve">Could not delete party.</w:t>
+      </w:r>
+    </w:p>
+    <w:p>
+      <w:pPr>
+        <w:pStyle w:val="Heading3"/>
+        <w:spacing w:after="80" w:before="200"/>
+      </w:pPr>
+      <w:r>
+        <w:rPr>
+          <w:rFonts w:ascii="Calibri" w:cs="Calibri" w:eastAsia="Calibri" w:hAnsi="Calibri"/>
+          <w:b/>
+          <w:bCs/>
+          <w:color w:val="1A1A18"/>
+          <w:sz w:val="24"/>
+          <w:szCs w:val="24"/>
+        </w:rPr>
+        <w:t xml:space="preserve">Redo (⋮)</w:t>
+      </w:r>
+    </w:p>
+    <w:p>
+      <w:pPr>
+        <w:spacing w:after="160" w:line="276"/>
+      </w:pPr>
+      <w:r>
+        <w:rPr>
+          <w:rFonts w:ascii="Calibri" w:cs="Calibri" w:eastAsia="Calibri" w:hAnsi="Calibri"/>
+          <w:b/>
+          <w:bCs/>
+          <w:color w:val="1A1A18"/>
+          <w:sz w:val="22"/>
+          <w:szCs w:val="22"/>
+        </w:rPr>
+        <w:t xml:space="preserve">Redo T1…T4</w:t>
+      </w:r>
+      <w:r>
+        <w:rPr>
+          <w:rFonts w:ascii="Calibri" w:cs="Calibri" w:eastAsia="Calibri" w:hAnsi="Calibri"/>
+          <w:color w:val="1A1A18"/>
+          <w:sz w:val="22"/>
+          <w:szCs w:val="22"/>
+        </w:rPr>
+        <w:t xml:space="preserve">, </w:t>
+      </w:r>
+      <w:r>
+        <w:rPr>
+          <w:rFonts w:ascii="Calibri" w:cs="Calibri" w:eastAsia="Calibri" w:hAnsi="Calibri"/>
+          <w:b/>
+          <w:bCs/>
+          <w:color w:val="1A1A18"/>
+          <w:sz w:val="22"/>
+          <w:szCs w:val="22"/>
+        </w:rPr>
+        <w:t xml:space="preserve">Redo all tests</w:t>
+      </w:r>
+      <w:r>
+        <w:rPr>
+          <w:rFonts w:ascii="Calibri" w:cs="Calibri" w:eastAsia="Calibri" w:hAnsi="Calibri"/>
+          <w:color w:val="1A1A18"/>
+          <w:sz w:val="22"/>
+          <w:szCs w:val="22"/>
+        </w:rPr>
+        <w:t xml:space="preserve">, </w:t>
+      </w:r>
+      <w:r>
+        <w:rPr>
+          <w:rFonts w:ascii="Calibri" w:cs="Calibri" w:eastAsia="Calibri" w:hAnsi="Calibri"/>
+          <w:b/>
+          <w:bCs/>
+          <w:color w:val="1A1A18"/>
+          <w:sz w:val="22"/>
+          <w:szCs w:val="22"/>
+        </w:rPr>
+        <w:t xml:space="preserve">Redo bot prompt</w:t>
+      </w:r>
+      <w:r>
+        <w:rPr>
+          <w:rFonts w:ascii="Calibri" w:cs="Calibri" w:eastAsia="Calibri" w:hAnsi="Calibri"/>
+          <w:color w:val="1A1A18"/>
+          <w:sz w:val="22"/>
+          <w:szCs w:val="22"/>
+        </w:rPr>
+        <w:t xml:space="preserve">, </w:t>
+      </w:r>
+      <w:r>
+        <w:rPr>
+          <w:rFonts w:ascii="Calibri" w:cs="Calibri" w:eastAsia="Calibri" w:hAnsi="Calibri"/>
+          <w:b/>
+          <w:bCs/>
+          <w:color w:val="1A1A18"/>
+          <w:sz w:val="22"/>
+          <w:szCs w:val="22"/>
+        </w:rPr>
+        <w:t xml:space="preserve">Redo all</w:t>
+      </w:r>
+      <w:r>
+        <w:rPr>
+          <w:rFonts w:ascii="Calibri" w:cs="Calibri" w:eastAsia="Calibri" w:hAnsi="Calibri"/>
+          <w:color w:val="1A1A18"/>
+          <w:sz w:val="22"/>
+          <w:szCs w:val="22"/>
+        </w:rPr>
+        <w:t xml:space="preserve"> — each with confirm: clears </w:t>
+      </w:r>
+      <w:r>
+        <w:rPr>
+          <w:rFonts w:ascii="Calibri" w:cs="Calibri" w:eastAsia="Calibri" w:hAnsi="Calibri"/>
+          <w:b/>
+          <w:bCs/>
+          <w:color w:val="1A1A18"/>
+          <w:sz w:val="22"/>
+          <w:szCs w:val="22"/>
+        </w:rPr>
+        <w:t xml:space="preserve">local</w:t>
+      </w:r>
+      <w:r>
+        <w:rPr>
+          <w:rFonts w:ascii="Calibri" w:cs="Calibri" w:eastAsia="Calibri" w:hAnsi="Calibri"/>
+          <w:color w:val="1A1A18"/>
+          <w:sz w:val="22"/>
+          <w:szCs w:val="22"/>
+        </w:rPr>
+        <w:t xml:space="preserve"> progress; party must recomplete the external test for a </w:t>
+      </w:r>
+      <w:r>
+        <w:rPr>
+          <w:rFonts w:ascii="Calibri" w:cs="Calibri" w:eastAsia="Calibri" w:hAnsi="Calibri"/>
+          <w:b/>
+          <w:bCs/>
+          <w:color w:val="1A1A18"/>
+          <w:sz w:val="22"/>
+          <w:szCs w:val="22"/>
+        </w:rPr>
+        <w:t xml:space="preserve">newer Airtable</w:t>
+      </w:r>
+      <w:r>
+        <w:rPr>
+          <w:rFonts w:ascii="Calibri" w:cs="Calibri" w:eastAsia="Calibri" w:hAnsi="Calibri"/>
+          <w:color w:val="1A1A18"/>
+          <w:sz w:val="22"/>
+          <w:szCs w:val="22"/>
+        </w:rPr>
+        <w:t xml:space="preserve"> record → </w:t>
+      </w:r>
+      <w:r>
+        <w:rPr>
+          <w:rFonts w:ascii="Calibri" w:cs="Calibri" w:eastAsia="Calibri" w:hAnsi="Calibri"/>
+          <w:b/>
+          <w:bCs/>
+          <w:color w:val="1A1A18"/>
+          <w:sz w:val="22"/>
+          <w:szCs w:val="22"/>
+        </w:rPr>
+        <w:t xml:space="preserve">Retest requested.</w:t>
+      </w:r>
+    </w:p>
+    <w:p>
+      <w:pPr>
+        <w:spacing w:after="160" w:line="276"/>
+      </w:pPr>
+      <w:r>
+        <w:rPr>
+          <w:rFonts w:ascii="Calibri" w:cs="Calibri" w:eastAsia="Calibri" w:hAnsi="Calibri"/>
+          <w:b/>
+          <w:bCs/>
+          <w:color w:val="1A1A18"/>
+          <w:sz w:val="22"/>
+          <w:szCs w:val="22"/>
+        </w:rPr>
+        <w:t xml:space="preserve">Redo all</w:t>
+      </w:r>
+      <w:r>
+        <w:rPr>
+          <w:rFonts w:ascii="Calibri" w:cs="Calibri" w:eastAsia="Calibri" w:hAnsi="Calibri"/>
+          <w:color w:val="1A1A18"/>
+          <w:sz w:val="22"/>
+          <w:szCs w:val="22"/>
+        </w:rPr>
+        <w:t xml:space="preserve"> ≈ room-card </w:t>
+      </w:r>
+      <w:r>
+        <w:rPr>
+          <w:rFonts w:ascii="Calibri" w:cs="Calibri" w:eastAsia="Calibri" w:hAnsi="Calibri"/>
+          <w:b/>
+          <w:bCs/>
+          <w:color w:val="1A1A18"/>
+          <w:sz w:val="22"/>
+          <w:szCs w:val="22"/>
+        </w:rPr>
+        <w:t xml:space="preserve">Request profile update</w:t>
+      </w:r>
+      <w:r>
+        <w:rPr>
+          <w:rFonts w:ascii="Calibri" w:cs="Calibri" w:eastAsia="Calibri" w:hAnsi="Calibri"/>
+          <w:color w:val="1A1A18"/>
+          <w:sz w:val="22"/>
+          <w:szCs w:val="22"/>
+        </w:rPr>
+        <w:t xml:space="preserve">.</w:t>
+      </w:r>
+    </w:p>
+    <w:p>
+      <w:pPr>
+        <w:spacing w:after="160" w:line="276"/>
+      </w:pPr>
+      <w:r>
+        <w:rPr>
+          <w:rFonts w:ascii="Calibri" w:cs="Calibri" w:eastAsia="Calibri" w:hAnsi="Calibri"/>
+          <w:color w:val="1A1A18"/>
+          <w:sz w:val="22"/>
+          <w:szCs w:val="22"/>
+        </w:rPr>
+        <w:t xml:space="preserve">Administrators see </w:t>
+      </w:r>
+      <w:r>
+        <w:rPr>
+          <w:rFonts w:ascii="Calibri" w:cs="Calibri" w:eastAsia="Calibri" w:hAnsi="Calibri"/>
+          <w:b/>
+          <w:bCs/>
+          <w:color w:val="1A1A18"/>
+          <w:sz w:val="22"/>
+          <w:szCs w:val="22"/>
+        </w:rPr>
+        <w:t xml:space="preserve">all</w:t>
+      </w:r>
+      <w:r>
+        <w:rPr>
+          <w:rFonts w:ascii="Calibri" w:cs="Calibri" w:eastAsia="Calibri" w:hAnsi="Calibri"/>
+          <w:color w:val="1A1A18"/>
+          <w:sz w:val="22"/>
+          <w:szCs w:val="22"/>
+        </w:rPr>
+        <w:t xml:space="preserve"> parties (including roomless) under their </w:t>
+      </w:r>
+      <w:r>
+        <w:rPr>
+          <w:rFonts w:ascii="Calibri" w:cs="Calibri" w:eastAsia="Calibri" w:hAnsi="Calibri"/>
+          <w:b/>
+          <w:bCs/>
+          <w:color w:val="1A1A18"/>
+          <w:sz w:val="22"/>
+          <w:szCs w:val="22"/>
+        </w:rPr>
+        <w:t xml:space="preserve">Sides</w:t>
+      </w:r>
+      <w:r>
+        <w:rPr>
+          <w:rFonts w:ascii="Calibri" w:cs="Calibri" w:eastAsia="Calibri" w:hAnsi="Calibri"/>
+          <w:color w:val="1A1A18"/>
+          <w:sz w:val="22"/>
+          <w:szCs w:val="22"/>
+        </w:rPr>
+        <w:t xml:space="preserve"> menu — see admin.md.</w:t>
+      </w:r>
+    </w:p>
+    <w:p>
+      <w:pPr>
+        <w:pBdr>
+          <w:bottom w:val="single" w:color="D8D4CC" w:sz="6" w:space="1"/>
+        </w:pBdr>
+        <w:spacing w:after="120" w:before="120"/>
+      </w:pPr>
+      <w:r>
+        <w:t xml:space="preserve"/>
+      </w:r>
+    </w:p>
+    <w:p>
+      <w:pPr>
+        <w:pStyle w:val="Heading2"/>
+        <w:pBdr>
+          <w:bottom w:val="single" w:color="9A7B2F" w:sz="8" w:space="4"/>
+        </w:pBdr>
+        <w:spacing w:after="120" w:before="280"/>
+      </w:pPr>
+      <w:r>
+        <w:rPr>
+          <w:rFonts w:ascii="Georgia" w:cs="Georgia" w:eastAsia="Georgia" w:hAnsi="Georgia"/>
+          <w:b/>
+          <w:bCs/>
+          <w:color w:val="1A1A18"/>
+          <w:sz w:val="28"/>
+          <w:szCs w:val="28"/>
+        </w:rPr>
+        <w:t xml:space="preserve">7. Room card</w:t>
+      </w:r>
+    </w:p>
+    <w:tbl>
+      <w:tblPr>
+        <w:tblW w:type="dxa" w:w="9000"/>
+        <w:tblBorders>
+          <w:top w:val="single" w:color="auto" w:sz="4"/>
+          <w:left w:val="single" w:color="auto" w:sz="4"/>
+          <w:bottom w:val="single" w:color="auto" w:sz="4"/>
+          <w:right w:val="single" w:color="auto" w:sz="4"/>
+          <w:insideH w:val="single" w:color="auto" w:sz="4"/>
+          <w:insideV w:val="single" w:color="auto" w:sz="4"/>
+        </w:tblBorders>
+      </w:tblPr>
+      <w:tblGrid>
+        <w:gridCol w:w="100"/>
+        <w:gridCol w:w="100"/>
+      </w:tblGrid>
+      <w:tr>
+        <w:tc>
+          <w:tcPr>
+            <w:tcW w:type="dxa" w:w="4500"/>
+            <w:tcBorders>
+              <w:top w:val="single" w:color="D8D4CC" w:sz="4"/>
+              <w:left w:val="single" w:color="D8D4CC" w:sz="4"/>
+              <w:bottom w:val="single" w:color="D8D4CC" w:sz="4"/>
+              <w:right w:val="single" w:color="D8D4CC" w:sz="4"/>
+            </w:tcBorders>
+            <w:shd w:fill="F6F3EC" w:val="clear"/>
+          </w:tcPr>
+          <w:p>
+            <w:r>
+              <w:rPr>
+                <w:rFonts w:ascii="Calibri" w:cs="Calibri" w:eastAsia="Calibri" w:hAnsi="Calibri"/>
+                <w:b/>
+                <w:bCs/>
+                <w:color w:val="1A1A18"/>
+                <w:sz w:val="18"/>
+                <w:szCs w:val="18"/>
+              </w:rPr>
+              <w:t xml:space="preserve">Block</w:t>
+            </w:r>
+          </w:p>
+        </w:tc>
+        <w:tc>
+          <w:tcPr>
+            <w:tcW w:type="dxa" w:w="4500"/>
+            <w:tcBorders>
+              <w:top w:val="single" w:color="D8D4CC" w:sz="4"/>
+              <w:left w:val="single" w:color="D8D4CC" w:sz="4"/>
+              <w:bottom w:val="single" w:color="D8D4CC" w:sz="4"/>
+              <w:right w:val="single" w:color="D8D4CC" w:sz="4"/>
+            </w:tcBorders>
+            <w:shd w:fill="F6F3EC" w:val="clear"/>
+          </w:tcPr>
+          <w:p>
+            <w:r>
+              <w:rPr>
+                <w:rFonts w:ascii="Calibri" w:cs="Calibri" w:eastAsia="Calibri" w:hAnsi="Calibri"/>
+                <w:b/>
+                <w:bCs/>
+                <w:color w:val="1A1A18"/>
+                <w:sz w:val="18"/>
+                <w:szCs w:val="18"/>
+              </w:rPr>
+              <w:t xml:space="preserve">What the mediator can do</w:t>
+            </w:r>
+          </w:p>
+        </w:tc>
+      </w:tr>
+      <w:tr>
+        <w:tc>
+          <w:tcPr>
+            <w:tcW w:type="dxa" w:w="4500"/>
+            <w:tcBorders>
+              <w:top w:val="single" w:color="D8D4CC" w:sz="4"/>
+              <w:left w:val="single" w:color="D8D4CC" w:sz="4"/>
+              <w:bottom w:val="single" w:color="D8D4CC" w:sz="4"/>
+              <w:right w:val="single" w:color="D8D4CC" w:sz="4"/>
+            </w:tcBorders>
+          </w:tcPr>
+          <w:p>
+            <w:r>
+              <w:rPr>
+                <w:rFonts w:ascii="Calibri" w:cs="Calibri" w:eastAsia="Calibri" w:hAnsi="Calibri"/>
+                <w:color w:val="1A1A18"/>
+                <w:sz w:val="18"/>
+                <w:szCs w:val="18"/>
+              </w:rPr>
+              <w:t xml:space="preserve">Header</w:t>
+            </w:r>
+          </w:p>
+        </w:tc>
+        <w:tc>
+          <w:tcPr>
+            <w:tcW w:type="dxa" w:w="4500"/>
+            <w:tcBorders>
+              <w:top w:val="single" w:color="D8D4CC" w:sz="4"/>
+              <w:left w:val="single" w:color="D8D4CC" w:sz="4"/>
+              <w:bottom w:val="single" w:color="D8D4CC" w:sz="4"/>
+              <w:right w:val="single" w:color="D8D4CC" w:sz="4"/>
+            </w:tcBorders>
+          </w:tcPr>
+          <w:p>
+            <w:r>
+              <w:rPr>
+                <w:rFonts w:ascii="Calibri" w:cs="Calibri" w:eastAsia="Calibri" w:hAnsi="Calibri"/>
+                <w:color w:val="1A1A18"/>
+                <w:sz w:val="18"/>
+                <w:szCs w:val="18"/>
+              </w:rPr>
+              <w:t xml:space="preserve">Title, date, jurisdiction</w:t>
+            </w:r>
+          </w:p>
+        </w:tc>
+      </w:tr>
+      <w:tr>
+        <w:tc>
+          <w:tcPr>
+            <w:tcW w:type="dxa" w:w="4500"/>
+            <w:tcBorders>
+              <w:top w:val="single" w:color="D8D4CC" w:sz="4"/>
+              <w:left w:val="single" w:color="D8D4CC" w:sz="4"/>
+              <w:bottom w:val="single" w:color="D8D4CC" w:sz="4"/>
+              <w:right w:val="single" w:color="D8D4CC" w:sz="4"/>
+            </w:tcBorders>
+          </w:tcPr>
+          <w:p>
+            <w:r>
+              <w:rPr>
+                <w:rFonts w:ascii="Calibri" w:cs="Calibri" w:eastAsia="Calibri" w:hAnsi="Calibri"/>
+                <w:b/>
+                <w:bCs/>
+                <w:color w:val="1A1A18"/>
+                <w:sz w:val="18"/>
+                <w:szCs w:val="18"/>
+              </w:rPr>
+              <w:t xml:space="preserve">Mediation details</w:t>
+            </w:r>
+          </w:p>
+        </w:tc>
+        <w:tc>
+          <w:tcPr>
+            <w:tcW w:type="dxa" w:w="4500"/>
+            <w:tcBorders>
+              <w:top w:val="single" w:color="D8D4CC" w:sz="4"/>
+              <w:left w:val="single" w:color="D8D4CC" w:sz="4"/>
+              <w:bottom w:val="single" w:color="D8D4CC" w:sz="4"/>
+              <w:right w:val="single" w:color="D8D4CC" w:sz="4"/>
+            </w:tcBorders>
+          </w:tcPr>
+          <w:p>
+            <w:r>
+              <w:rPr>
+                <w:rFonts w:ascii="Calibri" w:cs="Calibri" w:eastAsia="Calibri" w:hAnsi="Calibri"/>
+                <w:color w:val="1A1A18"/>
+                <w:sz w:val="18"/>
+                <w:szCs w:val="18"/>
+              </w:rPr>
+              <w:t xml:space="preserve">After start — dialogue, votes, agreement, </w:t>
+            </w:r>
+            <w:r>
+              <w:rPr>
+                <w:rFonts w:ascii="Calibri" w:cs="Calibri" w:eastAsia="Calibri" w:hAnsi="Calibri"/>
+                <w:b/>
+                <w:bCs/>
+                <w:color w:val="1A1A18"/>
+                <w:sz w:val="18"/>
+                <w:szCs w:val="18"/>
+              </w:rPr>
+              <w:t xml:space="preserve">Download results</w:t>
+            </w:r>
+          </w:p>
+        </w:tc>
+      </w:tr>
+      <w:tr>
+        <w:tc>
+          <w:tcPr>
+            <w:tcW w:type="dxa" w:w="4500"/>
+            <w:tcBorders>
+              <w:top w:val="single" w:color="D8D4CC" w:sz="4"/>
+              <w:left w:val="single" w:color="D8D4CC" w:sz="4"/>
+              <w:bottom w:val="single" w:color="D8D4CC" w:sz="4"/>
+              <w:right w:val="single" w:color="D8D4CC" w:sz="4"/>
+            </w:tcBorders>
+          </w:tcPr>
+          <w:p>
+            <w:r>
+              <w:rPr>
+                <w:rFonts w:ascii="Calibri" w:cs="Calibri" w:eastAsia="Calibri" w:hAnsi="Calibri"/>
+                <w:b/>
+                <w:bCs/>
+                <w:color w:val="1A1A18"/>
+                <w:sz w:val="18"/>
+                <w:szCs w:val="18"/>
+              </w:rPr>
+              <w:t xml:space="preserve">Mediation schedule</w:t>
+            </w:r>
+          </w:p>
+        </w:tc>
+        <w:tc>
+          <w:tcPr>
+            <w:tcW w:type="dxa" w:w="4500"/>
+            <w:tcBorders>
+              <w:top w:val="single" w:color="D8D4CC" w:sz="4"/>
+              <w:left w:val="single" w:color="D8D4CC" w:sz="4"/>
+              <w:bottom w:val="single" w:color="D8D4CC" w:sz="4"/>
+              <w:right w:val="single" w:color="D8D4CC" w:sz="4"/>
+            </w:tcBorders>
+          </w:tcPr>
+          <w:p>
+            <w:r>
+              <w:rPr>
+                <w:rFonts w:ascii="Calibri" w:cs="Calibri" w:eastAsia="Calibri" w:hAnsi="Calibri"/>
+                <w:color w:val="1A1A18"/>
+                <w:sz w:val="18"/>
+                <w:szCs w:val="18"/>
+              </w:rPr>
+              <w:t xml:space="preserve">Date, time, duration, readiness, lobby / session links</w:t>
+            </w:r>
+          </w:p>
+        </w:tc>
+      </w:tr>
+      <w:tr>
+        <w:tc>
+          <w:tcPr>
+            <w:tcW w:type="dxa" w:w="4500"/>
+            <w:tcBorders>
+              <w:top w:val="single" w:color="D8D4CC" w:sz="4"/>
+              <w:left w:val="single" w:color="D8D4CC" w:sz="4"/>
+              <w:bottom w:val="single" w:color="D8D4CC" w:sz="4"/>
+              <w:right w:val="single" w:color="D8D4CC" w:sz="4"/>
+            </w:tcBorders>
+          </w:tcPr>
+          <w:p>
+            <w:r>
+              <w:rPr>
+                <w:rFonts w:ascii="Calibri" w:cs="Calibri" w:eastAsia="Calibri" w:hAnsi="Calibri"/>
+                <w:b/>
+                <w:bCs/>
+                <w:color w:val="1A1A18"/>
+                <w:sz w:val="18"/>
+                <w:szCs w:val="18"/>
+              </w:rPr>
+              <w:t xml:space="preserve">Pipeline &amp; mediation log</w:t>
+            </w:r>
+          </w:p>
+        </w:tc>
+        <w:tc>
+          <w:tcPr>
+            <w:tcW w:type="dxa" w:w="4500"/>
+            <w:tcBorders>
+              <w:top w:val="single" w:color="D8D4CC" w:sz="4"/>
+              <w:left w:val="single" w:color="D8D4CC" w:sz="4"/>
+              <w:bottom w:val="single" w:color="D8D4CC" w:sz="4"/>
+              <w:right w:val="single" w:color="D8D4CC" w:sz="4"/>
+            </w:tcBorders>
+          </w:tcPr>
+          <w:p>
+            <w:r>
+              <w:rPr>
+                <w:rFonts w:ascii="Calibri" w:cs="Calibri" w:eastAsia="Calibri" w:hAnsi="Calibri"/>
+                <w:color w:val="1A1A18"/>
+                <w:sz w:val="18"/>
+                <w:szCs w:val="18"/>
+              </w:rPr>
+              <w:t xml:space="preserve">Timeline of preparation and the session</w:t>
+            </w:r>
+          </w:p>
+        </w:tc>
+      </w:tr>
+      <w:tr>
+        <w:tc>
+          <w:tcPr>
+            <w:tcW w:type="dxa" w:w="4500"/>
+            <w:tcBorders>
+              <w:top w:val="single" w:color="D8D4CC" w:sz="4"/>
+              <w:left w:val="single" w:color="D8D4CC" w:sz="4"/>
+              <w:bottom w:val="single" w:color="D8D4CC" w:sz="4"/>
+              <w:right w:val="single" w:color="D8D4CC" w:sz="4"/>
+            </w:tcBorders>
+          </w:tcPr>
+          <w:p>
+            <w:r>
+              <w:rPr>
+                <w:rFonts w:ascii="Calibri" w:cs="Calibri" w:eastAsia="Calibri" w:hAnsi="Calibri"/>
+                <w:b/>
+                <w:bCs/>
+                <w:color w:val="1A1A18"/>
+                <w:sz w:val="18"/>
+                <w:szCs w:val="18"/>
+              </w:rPr>
+              <w:t xml:space="preserve">Room details</w:t>
+            </w:r>
+          </w:p>
+        </w:tc>
+        <w:tc>
+          <w:tcPr>
+            <w:tcW w:type="dxa" w:w="4500"/>
+            <w:tcBorders>
+              <w:top w:val="single" w:color="D8D4CC" w:sz="4"/>
+              <w:left w:val="single" w:color="D8D4CC" w:sz="4"/>
+              <w:bottom w:val="single" w:color="D8D4CC" w:sz="4"/>
+              <w:right w:val="single" w:color="D8D4CC" w:sz="4"/>
+            </w:tcBorders>
+          </w:tcPr>
+          <w:p>
+            <w:r>
+              <w:rPr>
+                <w:rFonts w:ascii="Calibri" w:cs="Calibri" w:eastAsia="Calibri" w:hAnsi="Calibri"/>
+                <w:color w:val="1A1A18"/>
+                <w:sz w:val="18"/>
+                <w:szCs w:val="18"/>
+              </w:rPr>
+              <w:t xml:space="preserve">Title and description </w:t>
+            </w:r>
+            <w:r>
+              <w:rPr>
+                <w:rFonts w:ascii="Calibri" w:cs="Calibri" w:eastAsia="Calibri" w:hAnsi="Calibri"/>
+                <w:b/>
+                <w:bCs/>
+                <w:color w:val="1A1A18"/>
+                <w:sz w:val="18"/>
+                <w:szCs w:val="18"/>
+              </w:rPr>
+              <w:t xml:space="preserve">view only</w:t>
+            </w:r>
+          </w:p>
+        </w:tc>
+      </w:tr>
+      <w:tr>
+        <w:tc>
+          <w:tcPr>
+            <w:tcW w:type="dxa" w:w="4500"/>
+            <w:tcBorders>
+              <w:top w:val="single" w:color="D8D4CC" w:sz="4"/>
+              <w:left w:val="single" w:color="D8D4CC" w:sz="4"/>
+              <w:bottom w:val="single" w:color="D8D4CC" w:sz="4"/>
+              <w:right w:val="single" w:color="D8D4CC" w:sz="4"/>
+            </w:tcBorders>
+          </w:tcPr>
+          <w:p>
+            <w:r>
+              <w:rPr>
+                <w:rFonts w:ascii="Calibri" w:cs="Calibri" w:eastAsia="Calibri" w:hAnsi="Calibri"/>
+                <w:b/>
+                <w:bCs/>
+                <w:color w:val="1A1A18"/>
+                <w:sz w:val="18"/>
+                <w:szCs w:val="18"/>
+              </w:rPr>
+              <w:t xml:space="preserve">Participants</w:t>
+            </w:r>
+          </w:p>
+        </w:tc>
+        <w:tc>
+          <w:tcPr>
+            <w:tcW w:type="dxa" w:w="4500"/>
+            <w:tcBorders>
+              <w:top w:val="single" w:color="D8D4CC" w:sz="4"/>
+              <w:left w:val="single" w:color="D8D4CC" w:sz="4"/>
+              <w:bottom w:val="single" w:color="D8D4CC" w:sz="4"/>
+              <w:right w:val="single" w:color="D8D4CC" w:sz="4"/>
+            </w:tcBorders>
+          </w:tcPr>
+          <w:p>
+            <w:r>
+              <w:rPr>
+                <w:rFonts w:ascii="Calibri" w:cs="Calibri" w:eastAsia="Calibri" w:hAnsi="Calibri"/>
+                <w:color w:val="1A1A18"/>
+                <w:sz w:val="18"/>
+                <w:szCs w:val="18"/>
+              </w:rPr>
+              <w:t xml:space="preserve">Profile / tests, </w:t>
+            </w:r>
+            <w:r>
+              <w:rPr>
+                <w:rFonts w:ascii="Calibri" w:cs="Calibri" w:eastAsia="Calibri" w:hAnsi="Calibri"/>
+                <w:b/>
+                <w:bCs/>
+                <w:color w:val="1A1A18"/>
+                <w:sz w:val="18"/>
+                <w:szCs w:val="18"/>
+              </w:rPr>
+              <w:t xml:space="preserve">Request profile update</w:t>
+            </w:r>
+            <w:r>
+              <w:rPr>
+                <w:rFonts w:ascii="Calibri" w:cs="Calibri" w:eastAsia="Calibri" w:hAnsi="Calibri"/>
+                <w:color w:val="1A1A18"/>
+                <w:sz w:val="18"/>
+                <w:szCs w:val="18"/>
+              </w:rPr>
+              <w:t xml:space="preserve">, login/password, </w:t>
+            </w:r>
+            <w:r>
+              <w:rPr>
+                <w:rFonts w:ascii="Calibri" w:cs="Calibri" w:eastAsia="Calibri" w:hAnsi="Calibri"/>
+                <w:b/>
+                <w:bCs/>
+                <w:color w:val="1A1A18"/>
+                <w:sz w:val="18"/>
+                <w:szCs w:val="18"/>
+              </w:rPr>
+              <w:t xml:space="preserve">Copy Credentials</w:t>
+            </w:r>
+            <w:r>
+              <w:rPr>
+                <w:rFonts w:ascii="Calibri" w:cs="Calibri" w:eastAsia="Calibri" w:hAnsi="Calibri"/>
+                <w:color w:val="1A1A18"/>
+                <w:sz w:val="18"/>
+                <w:szCs w:val="18"/>
+              </w:rPr>
+              <w:t xml:space="preserve">, </w:t>
+            </w:r>
+            <w:r>
+              <w:rPr>
+                <w:rFonts w:ascii="Calibri" w:cs="Calibri" w:eastAsia="Calibri" w:hAnsi="Calibri"/>
+                <w:b/>
+                <w:bCs/>
+                <w:color w:val="1A1A18"/>
+                <w:sz w:val="18"/>
+                <w:szCs w:val="18"/>
+              </w:rPr>
+              <w:t xml:space="preserve">Magic Link</w:t>
+            </w:r>
+          </w:p>
+        </w:tc>
+      </w:tr>
+      <w:tr>
+        <w:tc>
+          <w:tcPr>
+            <w:tcW w:type="dxa" w:w="4500"/>
+            <w:tcBorders>
+              <w:top w:val="single" w:color="D8D4CC" w:sz="4"/>
+              <w:left w:val="single" w:color="D8D4CC" w:sz="4"/>
+              <w:bottom w:val="single" w:color="D8D4CC" w:sz="4"/>
+              <w:right w:val="single" w:color="D8D4CC" w:sz="4"/>
+            </w:tcBorders>
+          </w:tcPr>
+          <w:p>
+            <w:r>
+              <w:rPr>
+                <w:rFonts w:ascii="Calibri" w:cs="Calibri" w:eastAsia="Calibri" w:hAnsi="Calibri"/>
+                <w:b/>
+                <w:bCs/>
+                <w:color w:val="1A1A18"/>
+                <w:sz w:val="18"/>
+                <w:szCs w:val="18"/>
+              </w:rPr>
+              <w:t xml:space="preserve">Delete room</w:t>
+            </w:r>
+          </w:p>
+        </w:tc>
+        <w:tc>
+          <w:tcPr>
+            <w:tcW w:type="dxa" w:w="4500"/>
+            <w:tcBorders>
+              <w:top w:val="single" w:color="D8D4CC" w:sz="4"/>
+              <w:left w:val="single" w:color="D8D4CC" w:sz="4"/>
+              <w:bottom w:val="single" w:color="D8D4CC" w:sz="4"/>
+              <w:right w:val="single" w:color="D8D4CC" w:sz="4"/>
+            </w:tcBorders>
+          </w:tcPr>
+          <w:p>
+            <w:r>
+              <w:rPr>
+                <w:rFonts w:ascii="Calibri" w:cs="Calibri" w:eastAsia="Calibri" w:hAnsi="Calibri"/>
+                <w:color w:val="1A1A18"/>
+                <w:sz w:val="18"/>
+                <w:szCs w:val="18"/>
+              </w:rPr>
+              <w:t xml:space="preserve">Two options (see below)</w:t>
+            </w:r>
+          </w:p>
+        </w:tc>
+      </w:tr>
+    </w:tbl>
+    <w:p>
+      <w:pPr>
+        <w:spacing w:after="160"/>
+      </w:pPr>
+      <w:r>
+        <w:t xml:space="preserve"/>
+      </w:r>
+    </w:p>
+    <w:p>
+      <w:pPr>
+        <w:pStyle w:val="Heading3"/>
+        <w:spacing w:after="80" w:before="200"/>
+      </w:pPr>
+      <w:r>
+        <w:rPr>
+          <w:rFonts w:ascii="Calibri" w:cs="Calibri" w:eastAsia="Calibri" w:hAnsi="Calibri"/>
+          <w:b/>
+          <w:bCs/>
+          <w:color w:val="1A1A18"/>
+          <w:sz w:val="24"/>
+          <w:szCs w:val="24"/>
+        </w:rPr>
+        <w:t xml:space="preserve">Request profile update</w:t>
+      </w:r>
+    </w:p>
+    <w:p>
+      <w:pPr>
+        <w:spacing w:after="160" w:line="276"/>
+      </w:pPr>
+      <w:r>
+        <w:rPr>
+          <w:rFonts w:ascii="Calibri" w:cs="Calibri" w:eastAsia="Calibri" w:hAnsi="Calibri"/>
+          <w:color w:val="1A1A18"/>
+          <w:sz w:val="22"/>
+          <w:szCs w:val="22"/>
+        </w:rPr>
+        <w:t xml:space="preserve">Confirm → clears tests, bot, and related AI profiles; welcome/consent kept so the party returns to tests. Pending: </w:t>
+      </w:r>
+      <w:r>
+        <w:rPr>
+          <w:rFonts w:ascii="Calibri" w:cs="Calibri" w:eastAsia="Calibri" w:hAnsi="Calibri"/>
+          <w:b/>
+          <w:bCs/>
+          <w:color w:val="1A1A18"/>
+          <w:sz w:val="22"/>
+          <w:szCs w:val="22"/>
+        </w:rPr>
+        <w:t xml:space="preserve">Profile update requested — waiting for retests.</w:t>
+      </w:r>
+      <w:r>
+        <w:rPr>
+          <w:rFonts w:ascii="Calibri" w:cs="Calibri" w:eastAsia="Calibri" w:hAnsi="Calibri"/>
+          <w:color w:val="1A1A18"/>
+          <w:sz w:val="22"/>
+          <w:szCs w:val="22"/>
+        </w:rPr>
+        <w:t xml:space="preserve"> Same idea as Sides </w:t>
+      </w:r>
+      <w:r>
+        <w:rPr>
+          <w:rFonts w:ascii="Calibri" w:cs="Calibri" w:eastAsia="Calibri" w:hAnsi="Calibri"/>
+          <w:b/>
+          <w:bCs/>
+          <w:color w:val="1A1A18"/>
+          <w:sz w:val="22"/>
+          <w:szCs w:val="22"/>
+        </w:rPr>
+        <w:t xml:space="preserve">Redo all</w:t>
+      </w:r>
+      <w:r>
+        <w:rPr>
+          <w:rFonts w:ascii="Calibri" w:cs="Calibri" w:eastAsia="Calibri" w:hAnsi="Calibri"/>
+          <w:color w:val="1A1A18"/>
+          <w:sz w:val="22"/>
+          <w:szCs w:val="22"/>
+        </w:rPr>
+        <w:t xml:space="preserve">.</w:t>
+      </w:r>
+    </w:p>
+    <w:p>
+      <w:pPr>
+        <w:spacing w:after="160" w:line="276"/>
+      </w:pPr>
+      <w:r>
+        <w:rPr>
+          <w:rFonts w:ascii="Calibri" w:cs="Calibri" w:eastAsia="Calibri" w:hAnsi="Calibri"/>
+          <w:color w:val="1A1A18"/>
+          <w:sz w:val="22"/>
+          <w:szCs w:val="22"/>
+        </w:rPr>
+        <w:t xml:space="preserve">Readiness indicators: </w:t>
+      </w:r>
+      <w:r>
+        <w:rPr>
+          <w:rFonts w:ascii="Calibri" w:cs="Calibri" w:eastAsia="Calibri" w:hAnsi="Calibri"/>
+          <w:b/>
+          <w:bCs/>
+          <w:color w:val="1A1A18"/>
+          <w:sz w:val="22"/>
+          <w:szCs w:val="22"/>
+        </w:rPr>
+        <w:t xml:space="preserve">Party A/B ready</w:t>
+      </w:r>
+      <w:r>
+        <w:rPr>
+          <w:rFonts w:ascii="Calibri" w:cs="Calibri" w:eastAsia="Calibri" w:hAnsi="Calibri"/>
+          <w:color w:val="1A1A18"/>
+          <w:sz w:val="22"/>
+          <w:szCs w:val="22"/>
+        </w:rPr>
+        <w:t xml:space="preserve">, profile readiness, </w:t>
+      </w:r>
+      <w:r>
+        <w:rPr>
+          <w:rFonts w:ascii="Calibri" w:cs="Calibri" w:eastAsia="Calibri" w:hAnsi="Calibri"/>
+          <w:b/>
+          <w:bCs/>
+          <w:color w:val="1A1A18"/>
+          <w:sz w:val="22"/>
+          <w:szCs w:val="22"/>
+        </w:rPr>
+        <w:t xml:space="preserve">AI analysis</w:t>
+      </w:r>
+      <w:r>
+        <w:rPr>
+          <w:rFonts w:ascii="Calibri" w:cs="Calibri" w:eastAsia="Calibri" w:hAnsi="Calibri"/>
+          <w:color w:val="1A1A18"/>
+          <w:sz w:val="22"/>
+          <w:szCs w:val="22"/>
+        </w:rPr>
+        <w:t xml:space="preserve">. Incomplete pipeline steps may show </w:t>
+      </w:r>
+      <w:r>
+        <w:rPr>
+          <w:rFonts w:ascii="Calibri" w:cs="Calibri" w:eastAsia="Calibri" w:hAnsi="Calibri"/>
+          <w:b/>
+          <w:bCs/>
+          <w:color w:val="1A1A18"/>
+          <w:sz w:val="22"/>
+          <w:szCs w:val="22"/>
+        </w:rPr>
+        <w:t xml:space="preserve">Generating…</w:t>
+      </w:r>
+      <w:r>
+        <w:rPr>
+          <w:rFonts w:ascii="Calibri" w:cs="Calibri" w:eastAsia="Calibri" w:hAnsi="Calibri"/>
+          <w:color w:val="1A1A18"/>
+          <w:sz w:val="22"/>
+          <w:szCs w:val="22"/>
+        </w:rPr>
+        <w:t xml:space="preserve">.</w:t>
+      </w:r>
+    </w:p>
+    <w:p>
+      <w:pPr>
+        <w:pStyle w:val="Heading3"/>
+        <w:spacing w:after="80" w:before="200"/>
+      </w:pPr>
+      <w:r>
+        <w:rPr>
+          <w:rFonts w:ascii="Calibri" w:cs="Calibri" w:eastAsia="Calibri" w:hAnsi="Calibri"/>
+          <w:b/>
+          <w:bCs/>
+          <w:color w:val="1A1A18"/>
+          <w:sz w:val="24"/>
+          <w:szCs w:val="24"/>
+        </w:rPr>
+        <w:t xml:space="preserve">Delete room</w:t>
+      </w:r>
+    </w:p>
+    <w:tbl>
+      <w:tblPr>
+        <w:tblW w:type="dxa" w:w="9000"/>
+        <w:tblBorders>
+          <w:top w:val="single" w:color="auto" w:sz="4"/>
+          <w:left w:val="single" w:color="auto" w:sz="4"/>
+          <w:bottom w:val="single" w:color="auto" w:sz="4"/>
+          <w:right w:val="single" w:color="auto" w:sz="4"/>
+          <w:insideH w:val="single" w:color="auto" w:sz="4"/>
+          <w:insideV w:val="single" w:color="auto" w:sz="4"/>
+        </w:tblBorders>
+      </w:tblPr>
+      <w:tblGrid>
+        <w:gridCol w:w="100"/>
+        <w:gridCol w:w="100"/>
+      </w:tblGrid>
+      <w:tr>
+        <w:tc>
+          <w:tcPr>
+            <w:tcW w:type="dxa" w:w="4500"/>
+            <w:tcBorders>
+              <w:top w:val="single" w:color="D8D4CC" w:sz="4"/>
+              <w:left w:val="single" w:color="D8D4CC" w:sz="4"/>
+              <w:bottom w:val="single" w:color="D8D4CC" w:sz="4"/>
+              <w:right w:val="single" w:color="D8D4CC" w:sz="4"/>
+            </w:tcBorders>
+            <w:shd w:fill="F6F3EC" w:val="clear"/>
+          </w:tcPr>
+          <w:p>
+            <w:r>
+              <w:rPr>
+                <w:rFonts w:ascii="Calibri" w:cs="Calibri" w:eastAsia="Calibri" w:hAnsi="Calibri"/>
+                <w:b/>
+                <w:bCs/>
+                <w:color w:val="1A1A18"/>
+                <w:sz w:val="18"/>
+                <w:szCs w:val="18"/>
+              </w:rPr>
+              <w:t xml:space="preserve">Button</w:t>
+            </w:r>
+          </w:p>
+        </w:tc>
+        <w:tc>
+          <w:tcPr>
+            <w:tcW w:type="dxa" w:w="4500"/>
+            <w:tcBorders>
+              <w:top w:val="single" w:color="D8D4CC" w:sz="4"/>
+              <w:left w:val="single" w:color="D8D4CC" w:sz="4"/>
+              <w:bottom w:val="single" w:color="D8D4CC" w:sz="4"/>
+              <w:right w:val="single" w:color="D8D4CC" w:sz="4"/>
+            </w:tcBorders>
+            <w:shd w:fill="F6F3EC" w:val="clear"/>
+          </w:tcPr>
+          <w:p>
+            <w:r>
+              <w:rPr>
+                <w:rFonts w:ascii="Calibri" w:cs="Calibri" w:eastAsia="Calibri" w:hAnsi="Calibri"/>
+                <w:b/>
+                <w:bCs/>
+                <w:color w:val="1A1A18"/>
+                <w:sz w:val="18"/>
+                <w:szCs w:val="18"/>
+              </w:rPr>
+              <w:t xml:space="preserve">What happens</w:t>
+            </w:r>
+          </w:p>
+        </w:tc>
+      </w:tr>
+      <w:tr>
+        <w:tc>
+          <w:tcPr>
+            <w:tcW w:type="dxa" w:w="4500"/>
+            <w:tcBorders>
+              <w:top w:val="single" w:color="D8D4CC" w:sz="4"/>
+              <w:left w:val="single" w:color="D8D4CC" w:sz="4"/>
+              <w:bottom w:val="single" w:color="D8D4CC" w:sz="4"/>
+              <w:right w:val="single" w:color="D8D4CC" w:sz="4"/>
+            </w:tcBorders>
+          </w:tcPr>
+          <w:p>
+            <w:r>
+              <w:rPr>
+                <w:rFonts w:ascii="Calibri" w:cs="Calibri" w:eastAsia="Calibri" w:hAnsi="Calibri"/>
+                <w:b/>
+                <w:bCs/>
+                <w:color w:val="1A1A18"/>
+                <w:sz w:val="18"/>
+                <w:szCs w:val="18"/>
+              </w:rPr>
+              <w:t xml:space="preserve">Delete room only</w:t>
+            </w:r>
+          </w:p>
+        </w:tc>
+        <w:tc>
+          <w:tcPr>
+            <w:tcW w:type="dxa" w:w="4500"/>
+            <w:tcBorders>
+              <w:top w:val="single" w:color="D8D4CC" w:sz="4"/>
+              <w:left w:val="single" w:color="D8D4CC" w:sz="4"/>
+              <w:bottom w:val="single" w:color="D8D4CC" w:sz="4"/>
+              <w:right w:val="single" w:color="D8D4CC" w:sz="4"/>
+            </w:tcBorders>
+          </w:tcPr>
+          <w:p>
+            <w:r>
+              <w:rPr>
+                <w:rFonts w:ascii="Calibri" w:cs="Calibri" w:eastAsia="Calibri" w:hAnsi="Calibri"/>
+                <w:color w:val="1A1A18"/>
+                <w:sz w:val="18"/>
+                <w:szCs w:val="18"/>
+              </w:rPr>
+              <w:t xml:space="preserve">Removes this room. Party accounts are </w:t>
+            </w:r>
+            <w:r>
+              <w:rPr>
+                <w:rFonts w:ascii="Calibri" w:cs="Calibri" w:eastAsia="Calibri" w:hAnsi="Calibri"/>
+                <w:b/>
+                <w:bCs/>
+                <w:color w:val="1A1A18"/>
+                <w:sz w:val="18"/>
+                <w:szCs w:val="18"/>
+              </w:rPr>
+              <w:t xml:space="preserve">kept</w:t>
+            </w:r>
+            <w:r>
+              <w:rPr>
+                <w:rFonts w:ascii="Calibri" w:cs="Calibri" w:eastAsia="Calibri" w:hAnsi="Calibri"/>
+                <w:color w:val="1A1A18"/>
+                <w:sz w:val="18"/>
+                <w:szCs w:val="18"/>
+              </w:rPr>
+              <w:t xml:space="preserve"> (may become roomless).</w:t>
+            </w:r>
+          </w:p>
+        </w:tc>
+      </w:tr>
+      <w:tr>
+        <w:tc>
+          <w:tcPr>
+            <w:tcW w:type="dxa" w:w="4500"/>
+            <w:tcBorders>
+              <w:top w:val="single" w:color="D8D4CC" w:sz="4"/>
+              <w:left w:val="single" w:color="D8D4CC" w:sz="4"/>
+              <w:bottom w:val="single" w:color="D8D4CC" w:sz="4"/>
+              <w:right w:val="single" w:color="D8D4CC" w:sz="4"/>
+            </w:tcBorders>
+          </w:tcPr>
+          <w:p>
+            <w:r>
+              <w:rPr>
+                <w:rFonts w:ascii="Calibri" w:cs="Calibri" w:eastAsia="Calibri" w:hAnsi="Calibri"/>
+                <w:b/>
+                <w:bCs/>
+                <w:color w:val="1A1A18"/>
+                <w:sz w:val="18"/>
+                <w:szCs w:val="18"/>
+              </w:rPr>
+              <w:t xml:space="preserve">Delete room and parties</w:t>
+            </w:r>
+          </w:p>
+        </w:tc>
+        <w:tc>
+          <w:tcPr>
+            <w:tcW w:type="dxa" w:w="4500"/>
+            <w:tcBorders>
+              <w:top w:val="single" w:color="D8D4CC" w:sz="4"/>
+              <w:left w:val="single" w:color="D8D4CC" w:sz="4"/>
+              <w:bottom w:val="single" w:color="D8D4CC" w:sz="4"/>
+              <w:right w:val="single" w:color="D8D4CC" w:sz="4"/>
+            </w:tcBorders>
+          </w:tcPr>
+          <w:p>
+            <w:r>
+              <w:rPr>
+                <w:rFonts w:ascii="Calibri" w:cs="Calibri" w:eastAsia="Calibri" w:hAnsi="Calibri"/>
+                <w:color w:val="1A1A18"/>
+                <w:sz w:val="18"/>
+                <w:szCs w:val="18"/>
+              </w:rPr>
+              <w:t xml:space="preserve">Deletes this room and those party accounts; </w:t>
+            </w:r>
+            <w:r>
+              <w:rPr>
+                <w:rFonts w:ascii="Calibri" w:cs="Calibri" w:eastAsia="Calibri" w:hAnsi="Calibri"/>
+                <w:b/>
+                <w:bCs/>
+                <w:color w:val="1A1A18"/>
+                <w:sz w:val="18"/>
+                <w:szCs w:val="18"/>
+              </w:rPr>
+              <w:t xml:space="preserve">every other room</w:t>
+            </w:r>
+            <w:r>
+              <w:rPr>
+                <w:rFonts w:ascii="Calibri" w:cs="Calibri" w:eastAsia="Calibri" w:hAnsi="Calibri"/>
+                <w:color w:val="1A1A18"/>
+                <w:sz w:val="18"/>
+                <w:szCs w:val="18"/>
+              </w:rPr>
+              <w:t xml:space="preserve"> those parties are in is also deleted. Other people in related rooms stay as free accounts. Fails if a party also sits in rooms you do not own — ask admin.</w:t>
+            </w:r>
+          </w:p>
+        </w:tc>
+      </w:tr>
+    </w:tbl>
+    <w:p>
+      <w:pPr>
+        <w:spacing w:after="160"/>
+      </w:pPr>
+      <w:r>
+        <w:t xml:space="preserve"/>
+      </w:r>
+    </w:p>
+    <w:p>
+      <w:pPr>
+        <w:spacing w:after="160" w:line="276"/>
+      </w:pPr>
+      <w:r>
+        <w:rPr>
+          <w:rFonts w:ascii="Calibri" w:cs="Calibri" w:eastAsia="Calibri" w:hAnsi="Calibri"/>
+          <w:color w:val="1A1A18"/>
+          <w:sz w:val="22"/>
+          <w:szCs w:val="22"/>
+        </w:rPr>
+        <w:t xml:space="preserve">Both require confirmation and cannot be undone. Toast: </w:t>
+      </w:r>
+      <w:r>
+        <w:rPr>
+          <w:rFonts w:ascii="Calibri" w:cs="Calibri" w:eastAsia="Calibri" w:hAnsi="Calibri"/>
+          <w:b/>
+          <w:bCs/>
+          <w:color w:val="1A1A18"/>
+          <w:sz w:val="22"/>
+          <w:szCs w:val="22"/>
+        </w:rPr>
+        <w:t xml:space="preserve">Room deleted.</w:t>
       </w:r>
     </w:p>
     <w:p>

</xml_diff>